<commit_message>
Update changelog, manual, resources.
</commit_message>
<xml_diff>
--- a/docs/OCTOPUS_user_manual.docx
+++ b/docs/OCTOPUS_user_manual.docx
@@ -1,6 +1,6 @@
 
 <file path=word/document.xml><?xml version="1.0" encoding="utf-8"?>
-<w:document xmlns:wpc="http://schemas.microsoft.com/office/word/2010/wordprocessingCanvas" xmlns:cx="http://schemas.microsoft.com/office/drawing/2014/chartex" xmlns:cx1="http://schemas.microsoft.com/office/drawing/2015/9/8/chartex" xmlns:cx2="http://schemas.microsoft.com/office/drawing/2015/10/21/chartex" xmlns:cx3="http://schemas.microsoft.com/office/drawing/2016/5/9/chartex" xmlns:cx4="http://schemas.microsoft.com/office/drawing/2016/5/10/chartex" xmlns:cx5="http://schemas.microsoft.com/office/drawing/2016/5/11/chartex" xmlns:cx6="http://schemas.microsoft.com/office/drawing/2016/5/12/chartex" xmlns:cx7="http://schemas.microsoft.com/office/drawing/2016/5/13/chartex" xmlns:cx8="http://schemas.microsoft.com/office/drawing/2016/5/14/chartex" xmlns:mc="http://schemas.openxmlformats.org/markup-compatibility/2006" xmlns:aink="http://schemas.microsoft.com/office/drawing/2016/ink" xmlns:am3d="http://schemas.microsoft.com/office/drawing/2017/model3d" xmlns:o="urn:schemas-microsoft-com:office:office" xmlns:oel="http://schemas.microsoft.com/office/2019/extlst" xmlns:r="http://schemas.openxmlformats.org/officeDocument/2006/relationships" xmlns:m="http://schemas.openxmlformats.org/officeDocument/2006/math" xmlns:v="urn:schemas-microsoft-com:vml" xmlns:wp14="http://schemas.microsoft.com/office/word/2010/wordprocessingDrawing" xmlns:wp="http://schemas.openxmlformats.org/drawingml/2006/wordprocessingDrawing" xmlns:w10="urn:schemas-microsoft-com:office:word" xmlns:w="http://schemas.openxmlformats.org/wordprocessingml/2006/main" xmlns:w14="http://schemas.microsoft.com/office/word/2010/wordml" xmlns:w15="http://schemas.microsoft.com/office/word/2012/wordml" xmlns:w16cex="http://schemas.microsoft.com/office/word/2018/wordml/cex" xmlns:w16cid="http://schemas.microsoft.com/office/word/2016/wordml/cid" xmlns:w16="http://schemas.microsoft.com/office/word/2018/wordml" xmlns:w16sdtdh="http://schemas.microsoft.com/office/word/2020/wordml/sdtdatahash" xmlns:w16se="http://schemas.microsoft.com/office/word/2015/wordml/symex" xmlns:wpg="http://schemas.microsoft.com/office/word/2010/wordprocessingGroup" xmlns:wpi="http://schemas.microsoft.com/office/word/2010/wordprocessingInk" xmlns:wne="http://schemas.microsoft.com/office/word/2006/wordml" xmlns:wps="http://schemas.microsoft.com/office/word/2010/wordprocessingShape" mc:Ignorable="w14 w15 w16se w16cid w16 w16cex w16sdtdh wp14">
+<w:document xmlns:wpc="http://schemas.microsoft.com/office/word/2010/wordprocessingCanvas" xmlns:cx="http://schemas.microsoft.com/office/drawing/2014/chartex" xmlns:cx1="http://schemas.microsoft.com/office/drawing/2015/9/8/chartex" xmlns:cx2="http://schemas.microsoft.com/office/drawing/2015/10/21/chartex" xmlns:cx3="http://schemas.microsoft.com/office/drawing/2016/5/9/chartex" xmlns:cx4="http://schemas.microsoft.com/office/drawing/2016/5/10/chartex" xmlns:cx5="http://schemas.microsoft.com/office/drawing/2016/5/11/chartex" xmlns:cx6="http://schemas.microsoft.com/office/drawing/2016/5/12/chartex" xmlns:cx7="http://schemas.microsoft.com/office/drawing/2016/5/13/chartex" xmlns:cx8="http://schemas.microsoft.com/office/drawing/2016/5/14/chartex" xmlns:mc="http://schemas.openxmlformats.org/markup-compatibility/2006" xmlns:aink="http://schemas.microsoft.com/office/drawing/2016/ink" xmlns:am3d="http://schemas.microsoft.com/office/drawing/2017/model3d" xmlns:o="urn:schemas-microsoft-com:office:office" xmlns:oel="http://schemas.microsoft.com/office/2019/extlst" xmlns:r="http://schemas.openxmlformats.org/officeDocument/2006/relationships" xmlns:m="http://schemas.openxmlformats.org/officeDocument/2006/math" xmlns:v="urn:schemas-microsoft-com:vml" xmlns:wp14="http://schemas.microsoft.com/office/word/2010/wordprocessingDrawing" xmlns:wp="http://schemas.openxmlformats.org/drawingml/2006/wordprocessingDrawing" xmlns:w10="urn:schemas-microsoft-com:office:word" xmlns:w="http://schemas.openxmlformats.org/wordprocessingml/2006/main" xmlns:w14="http://schemas.microsoft.com/office/word/2010/wordml" xmlns:w15="http://schemas.microsoft.com/office/word/2012/wordml" xmlns:w16cex="http://schemas.microsoft.com/office/word/2018/wordml/cex" xmlns:w16cid="http://schemas.microsoft.com/office/word/2016/wordml/cid" xmlns:w16="http://schemas.microsoft.com/office/word/2018/wordml" xmlns:w16du="http://schemas.microsoft.com/office/word/2023/wordml/word16du" xmlns:w16sdtdh="http://schemas.microsoft.com/office/word/2020/wordml/sdtdatahash" xmlns:w16se="http://schemas.microsoft.com/office/word/2015/wordml/symex" xmlns:wpg="http://schemas.microsoft.com/office/word/2010/wordprocessingGroup" xmlns:wpi="http://schemas.microsoft.com/office/word/2010/wordprocessingInk" xmlns:wne="http://schemas.microsoft.com/office/word/2006/wordml" xmlns:wps="http://schemas.microsoft.com/office/word/2010/wordprocessingShape" mc:Ignorable="w14 w15 w16se w16cid w16 w16cex w16sdtdh w16du wp14">
   <w:body>
     <w:p>
       <w:pPr>
@@ -26,11 +26,21 @@
       <w:pPr>
         <w:pStyle w:val="Sous-titredudocument"/>
       </w:pPr>
-      <w:fldSimple w:instr=" SUBJECT   \* MERGEFORMAT ">
-        <w:r>
-          <w:t>User Manual</w:t>
-        </w:r>
-      </w:fldSimple>
+      <w:r>
+        <w:fldChar w:fldCharType="begin"/>
+      </w:r>
+      <w:r>
+        <w:instrText xml:space="preserve"> SUBJECT   \* MERGEFORMAT </w:instrText>
+      </w:r>
+      <w:r>
+        <w:fldChar w:fldCharType="separate"/>
+      </w:r>
+      <w:r>
+        <w:t>User Manual</w:t>
+      </w:r>
+      <w:r>
+        <w:fldChar w:fldCharType="end"/>
+      </w:r>
     </w:p>
     <w:p>
       <w:pPr>
@@ -488,7 +498,21 @@
                 <w:bCs/>
                 <w:lang w:val="en-US"/>
               </w:rPr>
-              <w:t xml:space="preserve">To convert ADCP (CASCADE) files to </w:t>
+              <w:t>To convert ADCP (CASCADE</w:t>
+            </w:r>
+            <w:r>
+              <w:rPr>
+                <w:bCs/>
+                <w:lang w:val="en-US"/>
+              </w:rPr>
+              <w:t>, CODAS</w:t>
+            </w:r>
+            <w:r>
+              <w:rPr>
+                <w:bCs/>
+                <w:lang w:val="en-US"/>
+              </w:rPr>
+              <w:t xml:space="preserve">) files to </w:t>
             </w:r>
             <w:proofErr w:type="spellStart"/>
             <w:r>
@@ -2213,25 +2237,7 @@
                 <w:color w:val="5B7591"/>
                 <w:sz w:val="20"/>
               </w:rPr>
-              <w:t xml:space="preserve">Modify Octopus requirements and </w:t>
-            </w:r>
-            <w:proofErr w:type="gramStart"/>
-            <w:r>
-              <w:rPr>
-                <w:rFonts w:cs="Times New Roman"/>
-                <w:color w:val="5B7591"/>
-                <w:sz w:val="20"/>
-              </w:rPr>
-              <w:t>installation</w:t>
-            </w:r>
-            <w:proofErr w:type="gramEnd"/>
-            <w:r>
-              <w:rPr>
-                <w:rFonts w:cs="Times New Roman"/>
-                <w:color w:val="5B7591"/>
-                <w:sz w:val="20"/>
-              </w:rPr>
-              <w:t xml:space="preserve">  </w:t>
+              <w:t xml:space="preserve">Modify Octopus requirements and installation  </w:t>
             </w:r>
           </w:p>
           <w:p>
@@ -3582,6 +3588,119 @@
                 <w:sz w:val="20"/>
               </w:rPr>
               <w:t>Add ADCP conversion.</w:t>
+            </w:r>
+          </w:p>
+        </w:tc>
+      </w:tr>
+      <w:tr>
+        <w:trPr>
+          <w:cnfStyle w:val="000000100000" w:firstRow="0" w:lastRow="0" w:firstColumn="0" w:lastColumn="0" w:oddVBand="0" w:evenVBand="0" w:oddHBand="1" w:evenHBand="0" w:firstRowFirstColumn="0" w:firstRowLastColumn="0" w:lastRowFirstColumn="0" w:lastRowLastColumn="0"/>
+        </w:trPr>
+        <w:tc>
+          <w:tcPr>
+            <w:tcW w:w="851" w:type="dxa"/>
+          </w:tcPr>
+          <w:p>
+            <w:pPr>
+              <w:pStyle w:val="Corpsdetexte"/>
+              <w:spacing w:before="0" w:after="0"/>
+              <w:rPr>
+                <w:sz w:val="20"/>
+                <w:lang w:val="en-US"/>
+              </w:rPr>
+            </w:pPr>
+            <w:r>
+              <w:rPr>
+                <w:sz w:val="20"/>
+                <w:lang w:val="en-US"/>
+              </w:rPr>
+              <w:t>1.11.0</w:t>
+            </w:r>
+          </w:p>
+        </w:tc>
+        <w:tc>
+          <w:tcPr>
+            <w:tcW w:w="1228" w:type="dxa"/>
+          </w:tcPr>
+          <w:p>
+            <w:pPr>
+              <w:pStyle w:val="Default"/>
+              <w:jc w:val="both"/>
+              <w:rPr>
+                <w:rFonts w:cs="Times New Roman"/>
+                <w:color w:val="5B7591"/>
+                <w:sz w:val="20"/>
+              </w:rPr>
+            </w:pPr>
+            <w:r>
+              <w:rPr>
+                <w:rFonts w:cs="Times New Roman"/>
+                <w:color w:val="5B7591"/>
+                <w:sz w:val="20"/>
+              </w:rPr>
+              <w:t xml:space="preserve">S. </w:t>
+            </w:r>
+            <w:proofErr w:type="spellStart"/>
+            <w:r>
+              <w:rPr>
+                <w:rFonts w:cs="Times New Roman"/>
+                <w:color w:val="5B7591"/>
+                <w:sz w:val="20"/>
+              </w:rPr>
+              <w:t>Crouzille</w:t>
+            </w:r>
+            <w:proofErr w:type="spellEnd"/>
+          </w:p>
+        </w:tc>
+        <w:tc>
+          <w:tcPr>
+            <w:tcW w:w="1182" w:type="dxa"/>
+          </w:tcPr>
+          <w:p>
+            <w:pPr>
+              <w:pStyle w:val="Default"/>
+              <w:jc w:val="both"/>
+              <w:rPr>
+                <w:rFonts w:cs="Times New Roman"/>
+                <w:color w:val="5B7591"/>
+                <w:sz w:val="20"/>
+              </w:rPr>
+            </w:pPr>
+            <w:r>
+              <w:rPr>
+                <w:rFonts w:cs="Times New Roman"/>
+                <w:color w:val="5B7591"/>
+                <w:sz w:val="20"/>
+              </w:rPr>
+              <w:t>19/09/2024</w:t>
+            </w:r>
+          </w:p>
+        </w:tc>
+        <w:tc>
+          <w:tcPr>
+            <w:tcW w:w="5244" w:type="dxa"/>
+          </w:tcPr>
+          <w:p>
+            <w:pPr>
+              <w:pStyle w:val="Default"/>
+              <w:numPr>
+                <w:ilvl w:val="0"/>
+                <w:numId w:val="35"/>
+              </w:numPr>
+              <w:jc w:val="both"/>
+              <w:rPr>
+                <w:rFonts w:cs="Times New Roman"/>
+                <w:color w:val="5B7591"/>
+                <w:sz w:val="20"/>
+              </w:rPr>
+            </w:pPr>
+            <w:r>
+              <w:rPr>
+                <w:rFonts w:cs="Times New Roman"/>
+                <w:color w:val="5B7591"/>
+                <w:sz w:val="20"/>
+              </w:rPr>
+              <w:t>Add ADCP CODAS conversion.</w:t>
             </w:r>
           </w:p>
         </w:tc>
@@ -5097,23 +5216,7 @@
           <w:rFonts w:asciiTheme="minorHAnsi" w:hAnsiTheme="minorHAnsi"/>
           <w:szCs w:val="22"/>
         </w:rPr>
-        <w:t xml:space="preserve"> </w:t>
-      </w:r>
-      <w:proofErr w:type="gramStart"/>
-      <w:r>
-        <w:rPr>
-          <w:rFonts w:asciiTheme="minorHAnsi" w:hAnsiTheme="minorHAnsi"/>
-          <w:szCs w:val="22"/>
-        </w:rPr>
-        <w:t>converter</w:t>
-      </w:r>
-      <w:proofErr w:type="gramEnd"/>
-      <w:r>
-        <w:rPr>
-          <w:rFonts w:asciiTheme="minorHAnsi" w:hAnsiTheme="minorHAnsi"/>
-          <w:szCs w:val="22"/>
-        </w:rPr>
-        <w:t xml:space="preserve"> </w:t>
+        <w:t xml:space="preserve"> converter </w:t>
       </w:r>
       <w:r>
         <w:rPr>
@@ -5344,13 +5447,8 @@
       </w:r>
       <w:proofErr w:type="spellEnd"/>
       <w:r>
-        <w:t xml:space="preserve"> </w:t>
-      </w:r>
-      <w:proofErr w:type="gramStart"/>
-      <w:r>
-        <w:t>files</w:t>
-      </w:r>
-      <w:proofErr w:type="gramEnd"/>
+        <w:t xml:space="preserve"> files</w:t>
+      </w:r>
     </w:p>
     <w:p>
       <w:pPr>
@@ -5425,13 +5523,8 @@
       </w:r>
       <w:proofErr w:type="spellEnd"/>
       <w:r>
-        <w:t xml:space="preserve"> </w:t>
-      </w:r>
-      <w:proofErr w:type="gramStart"/>
-      <w:r>
-        <w:t>files</w:t>
-      </w:r>
-      <w:proofErr w:type="gramEnd"/>
+        <w:t xml:space="preserve"> files</w:t>
+      </w:r>
     </w:p>
     <w:p>
       <w:pPr>
@@ -5443,7 +5536,13 @@
         <w:jc w:val="left"/>
       </w:pPr>
       <w:r>
-        <w:t xml:space="preserve">Convert ADCP (CASCADE) files to </w:t>
+        <w:t>Convert ADCP (CASCADE</w:t>
+      </w:r>
+      <w:r>
+        <w:t>, CODAS</w:t>
+      </w:r>
+      <w:r>
+        <w:t xml:space="preserve">) files to </w:t>
       </w:r>
       <w:proofErr w:type="spellStart"/>
       <w:r>
@@ -5459,13 +5558,8 @@
       </w:r>
       <w:proofErr w:type="spellEnd"/>
       <w:r>
-        <w:t xml:space="preserve"> </w:t>
-      </w:r>
-      <w:proofErr w:type="gramStart"/>
-      <w:r>
-        <w:t>files</w:t>
-      </w:r>
-      <w:proofErr w:type="gramEnd"/>
+        <w:t xml:space="preserve"> files</w:t>
+      </w:r>
     </w:p>
     <w:p>
       <w:pPr>
@@ -5855,13 +5949,8 @@
     </w:p>
     <w:p>
       <w:r>
-        <w:t xml:space="preserve">The change log is available in octopus menu help&gt; </w:t>
-      </w:r>
-      <w:proofErr w:type="gramStart"/>
-      <w:r>
-        <w:t>about</w:t>
-      </w:r>
-      <w:proofErr w:type="gramEnd"/>
+        <w:t>The change log is available in octopus menu help&gt; about</w:t>
+      </w:r>
     </w:p>
     <w:p/>
     <w:p>
@@ -5878,7 +5967,6 @@
         <w:lastRenderedPageBreak/>
         <w:t xml:space="preserve">Launch on </w:t>
       </w:r>
-      <w:proofErr w:type="gramStart"/>
       <w:r>
         <w:t>windows</w:t>
       </w:r>
@@ -5888,7 +5976,6 @@
       <w:bookmarkEnd w:id="13"/>
       <w:bookmarkEnd w:id="14"/>
       <w:bookmarkEnd w:id="15"/>
-      <w:proofErr w:type="gramEnd"/>
     </w:p>
     <w:p>
       <w:r>
@@ -5923,16 +6010,8 @@
         <w:rPr>
           <w:color w:val="5B7591"/>
         </w:rPr>
-        <w:t xml:space="preserve">In the octopus installation directory (containing the octopus.jar file): create a file named </w:t>
-      </w:r>
-      <w:proofErr w:type="gramStart"/>
-      <w:r>
-        <w:rPr>
-          <w:color w:val="5B7591"/>
-        </w:rPr>
-        <w:t>octopus.bat</w:t>
-      </w:r>
-      <w:proofErr w:type="gramEnd"/>
+        <w:t>In the octopus installation directory (containing the octopus.jar file): create a file named octopus.bat</w:t>
+      </w:r>
     </w:p>
     <w:p>
       <w:pPr>
@@ -6803,16 +6882,8 @@
         <w:rPr>
           <w:color w:val="5B7591"/>
         </w:rPr>
-        <w:t xml:space="preserve">In the octopus installation directory (containing the octopus.jar file): create a file named </w:t>
-      </w:r>
-      <w:proofErr w:type="gramStart"/>
-      <w:r>
-        <w:rPr>
-          <w:color w:val="5B7591"/>
-        </w:rPr>
-        <w:t>octopus_proxy.sh</w:t>
-      </w:r>
-      <w:proofErr w:type="gramEnd"/>
+        <w:t>In the octopus installation directory (containing the octopus.jar file): create a file named octopus_proxy.sh</w:t>
+      </w:r>
     </w:p>
     <w:p>
       <w:pPr>
@@ -7570,16 +7641,11 @@
       <w:bookmarkStart w:id="21" w:name="_Toc2085914"/>
       <w:bookmarkStart w:id="22" w:name="_Toc60921554"/>
       <w:r>
-        <w:t xml:space="preserve">Get </w:t>
-      </w:r>
-      <w:proofErr w:type="gramStart"/>
-      <w:r>
-        <w:t>started</w:t>
+        <w:t>Get started</w:t>
       </w:r>
       <w:bookmarkEnd w:id="20"/>
       <w:bookmarkEnd w:id="21"/>
       <w:bookmarkEnd w:id="22"/>
-      <w:proofErr w:type="gramEnd"/>
     </w:p>
     <w:p>
       <w:pPr>
@@ -7609,19 +7675,11 @@
         <w:rPr>
           <w:lang w:val="en-US"/>
         </w:rPr>
-        <w:t>Menu Edit/</w:t>
-      </w:r>
-      <w:proofErr w:type="gramStart"/>
-      <w:r>
-        <w:rPr>
-          <w:lang w:val="en-US"/>
-        </w:rPr>
-        <w:t>settings</w:t>
+        <w:t>Menu Edit/settings</w:t>
       </w:r>
       <w:bookmarkEnd w:id="26"/>
       <w:bookmarkEnd w:id="27"/>
       <w:bookmarkEnd w:id="28"/>
-      <w:proofErr w:type="gramEnd"/>
     </w:p>
     <w:p>
       <w:pPr>
@@ -7899,19 +7957,11 @@
         <w:rPr>
           <w:lang w:val="en-US"/>
         </w:rPr>
-        <w:t xml:space="preserve">Menu Edit/Coupling </w:t>
-      </w:r>
-      <w:proofErr w:type="gramStart"/>
-      <w:r>
-        <w:rPr>
-          <w:lang w:val="en-US"/>
-        </w:rPr>
-        <w:t>table</w:t>
+        <w:t>Menu Edit/Coupling table</w:t>
       </w:r>
       <w:bookmarkEnd w:id="29"/>
       <w:bookmarkEnd w:id="30"/>
       <w:bookmarkEnd w:id="31"/>
-      <w:proofErr w:type="gramEnd"/>
     </w:p>
     <w:p>
       <w:r>
@@ -8087,13 +8137,8 @@
         <w:pStyle w:val="Titre4"/>
       </w:pPr>
       <w:r>
-        <w:t xml:space="preserve">Delete </w:t>
-      </w:r>
-      <w:proofErr w:type="gramStart"/>
-      <w:r>
-        <w:t>all</w:t>
-      </w:r>
-      <w:proofErr w:type="gramEnd"/>
+        <w:t>Delete all</w:t>
+      </w:r>
     </w:p>
     <w:p>
       <w:r>
@@ -8704,6 +8749,47 @@
           </w:p>
         </w:tc>
       </w:tr>
+      <w:tr>
+        <w:tc>
+          <w:tcPr>
+            <w:tcW w:w="2910" w:type="dxa"/>
+          </w:tcPr>
+          <w:p>
+            <w:pPr>
+              <w:spacing w:before="0"/>
+            </w:pPr>
+            <w:r>
+              <w:t>ADCP (CODAS)</w:t>
+            </w:r>
+          </w:p>
+        </w:tc>
+        <w:tc>
+          <w:tcPr>
+            <w:tcW w:w="1418" w:type="dxa"/>
+          </w:tcPr>
+          <w:p>
+            <w:pPr>
+              <w:spacing w:before="0"/>
+              <w:jc w:val="center"/>
+              <w:rPr>
+                <w:rFonts w:ascii="OpenSymbol" w:eastAsia="OpenSymbol" w:hAnsi="OpenSymbol" w:cs="OpenSymbol"/>
+                <w:color w:val="FF6633"/>
+                <w:sz w:val="32"/>
+                <w:szCs w:val="32"/>
+              </w:rPr>
+            </w:pPr>
+            <w:r>
+              <w:rPr>
+                <w:rFonts w:ascii="OpenSymbol" w:eastAsia="OpenSymbol" w:hAnsi="OpenSymbol" w:cs="OpenSymbol"/>
+                <w:color w:val="FF6633"/>
+                <w:sz w:val="32"/>
+                <w:szCs w:val="32"/>
+              </w:rPr>
+              <w:t>✗</w:t>
+            </w:r>
+          </w:p>
+        </w:tc>
+      </w:tr>
     </w:tbl>
     <w:p/>
     <w:p>
@@ -8738,13 +8824,8 @@
         <w:t>conversions/splits</w:t>
       </w:r>
       <w:r>
-        <w:t xml:space="preserve"> are listed in the table </w:t>
-      </w:r>
-      <w:proofErr w:type="gramStart"/>
-      <w:r>
-        <w:t>below</w:t>
-      </w:r>
-      <w:proofErr w:type="gramEnd"/>
+        <w:t xml:space="preserve"> are listed in the table below</w:t>
+      </w:r>
     </w:p>
     <w:p>
       <w:pPr>
@@ -9489,6 +9570,7 @@
               </w:rPr>
             </w:pPr>
             <w:r>
+              <w:lastRenderedPageBreak/>
               <w:t>MGDv81</w:t>
             </w:r>
           </w:p>
@@ -9589,7 +9671,6 @@
           </w:tcPr>
           <w:p>
             <w:r>
-              <w:lastRenderedPageBreak/>
               <w:t>MGDv98</w:t>
             </w:r>
           </w:p>
@@ -9907,6 +9988,118 @@
           </w:p>
         </w:tc>
       </w:tr>
+      <w:tr>
+        <w:tc>
+          <w:tcPr>
+            <w:tcW w:w="2383" w:type="dxa"/>
+          </w:tcPr>
+          <w:p>
+            <w:r>
+              <w:t>ADCP (CODAS)</w:t>
+            </w:r>
+          </w:p>
+        </w:tc>
+        <w:tc>
+          <w:tcPr>
+            <w:tcW w:w="1393" w:type="dxa"/>
+          </w:tcPr>
+          <w:p>
+            <w:pPr>
+              <w:jc w:val="center"/>
+              <w:rPr>
+                <w:rFonts w:ascii="OpenSymbol" w:eastAsia="OpenSymbol" w:hAnsi="OpenSymbol" w:cs="OpenSymbol"/>
+                <w:color w:val="FF6633"/>
+                <w:sz w:val="32"/>
+                <w:szCs w:val="32"/>
+              </w:rPr>
+            </w:pPr>
+            <w:r>
+              <w:rPr>
+                <w:rFonts w:ascii="OpenSymbol" w:eastAsia="OpenSymbol" w:hAnsi="OpenSymbol" w:cs="OpenSymbol"/>
+                <w:color w:val="FF6633"/>
+                <w:sz w:val="32"/>
+                <w:szCs w:val="32"/>
+              </w:rPr>
+              <w:t>✗</w:t>
+            </w:r>
+          </w:p>
+        </w:tc>
+        <w:tc>
+          <w:tcPr>
+            <w:tcW w:w="1774" w:type="dxa"/>
+          </w:tcPr>
+          <w:p>
+            <w:pPr>
+              <w:jc w:val="center"/>
+              <w:rPr>
+                <w:rFonts w:ascii="OpenSymbol" w:eastAsia="OpenSymbol" w:hAnsi="OpenSymbol" w:cs="OpenSymbol"/>
+                <w:color w:val="FF6633"/>
+                <w:sz w:val="32"/>
+                <w:szCs w:val="32"/>
+              </w:rPr>
+            </w:pPr>
+            <w:r>
+              <w:rPr>
+                <w:rFonts w:ascii="OpenSymbol" w:eastAsia="OpenSymbol" w:hAnsi="OpenSymbol" w:cs="OpenSymbol"/>
+                <w:color w:val="FF6633"/>
+                <w:sz w:val="32"/>
+                <w:szCs w:val="32"/>
+              </w:rPr>
+              <w:t>✗</w:t>
+            </w:r>
+          </w:p>
+        </w:tc>
+        <w:tc>
+          <w:tcPr>
+            <w:tcW w:w="1654" w:type="dxa"/>
+          </w:tcPr>
+          <w:p>
+            <w:pPr>
+              <w:jc w:val="center"/>
+              <w:rPr>
+                <w:rFonts w:ascii="OpenSymbol" w:eastAsia="OpenSymbol" w:hAnsi="OpenSymbol" w:cs="OpenSymbol"/>
+                <w:color w:val="FF6633"/>
+                <w:sz w:val="32"/>
+                <w:szCs w:val="32"/>
+              </w:rPr>
+            </w:pPr>
+            <w:r>
+              <w:rPr>
+                <w:rFonts w:ascii="OpenSymbol" w:eastAsia="OpenSymbol" w:hAnsi="OpenSymbol" w:cs="OpenSymbol"/>
+                <w:color w:val="FF6633"/>
+                <w:sz w:val="32"/>
+                <w:szCs w:val="32"/>
+              </w:rPr>
+              <w:t>✗</w:t>
+            </w:r>
+          </w:p>
+        </w:tc>
+        <w:tc>
+          <w:tcPr>
+            <w:tcW w:w="1858" w:type="dxa"/>
+          </w:tcPr>
+          <w:p>
+            <w:pPr>
+              <w:jc w:val="center"/>
+              <w:rPr>
+                <w:rFonts w:ascii="OpenSymbol" w:eastAsia="OpenSymbol" w:hAnsi="OpenSymbol" w:cs="OpenSymbol"/>
+                <w:color w:val="FF6633"/>
+                <w:sz w:val="32"/>
+                <w:szCs w:val="32"/>
+              </w:rPr>
+            </w:pPr>
+            <w:r>
+              <w:rPr>
+                <w:rFonts w:ascii="OpenSymbol" w:eastAsia="OpenSymbol" w:hAnsi="OpenSymbol" w:cs="OpenSymbol"/>
+                <w:color w:val="FF6633"/>
+                <w:sz w:val="32"/>
+                <w:szCs w:val="32"/>
+              </w:rPr>
+              <w:t>✗</w:t>
+            </w:r>
+          </w:p>
+        </w:tc>
+      </w:tr>
     </w:tbl>
     <w:p>
       <w:pPr>
@@ -10198,25 +10391,7 @@
           <w:sz w:val="22"/>
           <w:szCs w:val="22"/>
         </w:rPr>
-        <w:t xml:space="preserve">update URLs for CDIs, </w:t>
-      </w:r>
-      <w:proofErr w:type="gramStart"/>
-      <w:r>
-        <w:rPr>
-          <w:color w:val="5B7591"/>
-          <w:sz w:val="22"/>
-          <w:szCs w:val="22"/>
-        </w:rPr>
-        <w:t>CSRs</w:t>
-      </w:r>
-      <w:proofErr w:type="gramEnd"/>
-      <w:r>
-        <w:rPr>
-          <w:color w:val="5B7591"/>
-          <w:sz w:val="22"/>
-          <w:szCs w:val="22"/>
-        </w:rPr>
-        <w:t xml:space="preserve"> and N</w:t>
+        <w:t>update URLs for CDIs, CSRs and N</w:t>
       </w:r>
       <w:r>
         <w:rPr>
@@ -10666,20 +10841,12 @@
         <w:rPr>
           <w:lang w:val="en-US"/>
         </w:rPr>
-        <w:t xml:space="preserve">Split to mono station </w:t>
-      </w:r>
-      <w:proofErr w:type="gramStart"/>
-      <w:r>
-        <w:rPr>
-          <w:lang w:val="en-US"/>
-        </w:rPr>
-        <w:t>files</w:t>
+        <w:t>Split to mono station files</w:t>
       </w:r>
       <w:bookmarkEnd w:id="49"/>
       <w:bookmarkEnd w:id="50"/>
       <w:bookmarkEnd w:id="51"/>
       <w:bookmarkEnd w:id="52"/>
-      <w:proofErr w:type="gramEnd"/>
     </w:p>
     <w:p>
       <w:pPr>
@@ -10750,20 +10917,12 @@
         <w:rPr>
           <w:lang w:val="en-US"/>
         </w:rPr>
-        <w:t xml:space="preserve">Select the output file or </w:t>
-      </w:r>
-      <w:proofErr w:type="gramStart"/>
-      <w:r>
-        <w:rPr>
-          <w:lang w:val="en-US"/>
-        </w:rPr>
-        <w:t>directory</w:t>
+        <w:t>Select the output file or directory</w:t>
       </w:r>
       <w:bookmarkEnd w:id="53"/>
       <w:bookmarkEnd w:id="54"/>
       <w:bookmarkEnd w:id="55"/>
       <w:bookmarkEnd w:id="56"/>
-      <w:proofErr w:type="gramEnd"/>
     </w:p>
     <w:p>
       <w:pPr>
@@ -11582,17 +11741,8 @@
           <w:color w:val="5B7591"/>
           <w:lang w:val="en-US"/>
         </w:rPr>
-        <w:t xml:space="preserve">Output is the path set in the output file/directory </w:t>
-      </w:r>
-      <w:proofErr w:type="gramStart"/>
-      <w:r>
-        <w:rPr>
-          <w:color w:val="5B7591"/>
-          <w:lang w:val="en-US"/>
-        </w:rPr>
-        <w:t>field</w:t>
-      </w:r>
-      <w:proofErr w:type="gramEnd"/>
+        <w:t>Output is the path set in the output file/directory field</w:t>
+      </w:r>
     </w:p>
     <w:p>
       <w:pPr>
@@ -11620,17 +11770,8 @@
           <w:color w:val="5B7591"/>
           <w:lang w:val="en-US"/>
         </w:rPr>
-        <w:t xml:space="preserve"> is the name of one input file in the input </w:t>
-      </w:r>
-      <w:proofErr w:type="gramStart"/>
-      <w:r>
-        <w:rPr>
-          <w:color w:val="5B7591"/>
-          <w:lang w:val="en-US"/>
-        </w:rPr>
-        <w:t>directory</w:t>
-      </w:r>
-      <w:proofErr w:type="gramEnd"/>
+        <w:t xml:space="preserve"> is the name of one input file in the input directory</w:t>
+      </w:r>
     </w:p>
     <w:p>
       <w:pPr>
@@ -12347,16 +12488,8 @@
         <w:rPr>
           <w:b/>
         </w:rPr>
-        <w:t xml:space="preserve">Check a file or a </w:t>
-      </w:r>
-      <w:proofErr w:type="gramStart"/>
-      <w:r>
-        <w:rPr>
-          <w:b/>
-        </w:rPr>
-        <w:t>directory</w:t>
-      </w:r>
-      <w:proofErr w:type="gramEnd"/>
+        <w:t>Check a file or a directory</w:t>
+      </w:r>
     </w:p>
     <w:p>
       <w:pPr>
@@ -12465,307 +12598,291 @@
         <w:rPr>
           <w:b/>
         </w:rPr>
-        <w:t xml:space="preserve">Convert a file or a </w:t>
+        <w:t>Convert a file or a directory</w:t>
+      </w:r>
+    </w:p>
+    <w:p>
+      <w:pPr>
+        <w:spacing w:after="120"/>
+        <w:rPr>
+          <w:color w:val="FF3300"/>
+        </w:rPr>
+      </w:pPr>
+      <w:r>
+        <w:t xml:space="preserve">[directory\] </w:t>
+      </w:r>
+      <w:r>
+        <w:rPr>
+          <w:i/>
+        </w:rPr>
+        <w:t xml:space="preserve">java -jar octopus.jar </w:t>
+      </w:r>
+      <w:r>
+        <w:rPr>
+          <w:color w:val="CC00FF"/>
+        </w:rPr>
+        <w:t>[-c &lt;</w:t>
+      </w:r>
+      <w:proofErr w:type="spellStart"/>
+      <w:r>
+        <w:rPr>
+          <w:color w:val="CC00FF"/>
+        </w:rPr>
+        <w:t>arg</w:t>
+      </w:r>
+      <w:proofErr w:type="spellEnd"/>
+      <w:r>
+        <w:rPr>
+          <w:color w:val="CC00FF"/>
+        </w:rPr>
+        <w:t xml:space="preserve">&gt;] </w:t>
+      </w:r>
+      <w:r>
+        <w:rPr>
+          <w:color w:val="538135" w:themeColor="accent6" w:themeShade="BF"/>
+        </w:rPr>
+        <w:t>-f &lt;</w:t>
+      </w:r>
+      <w:proofErr w:type="spellStart"/>
+      <w:r>
+        <w:rPr>
+          <w:color w:val="538135" w:themeColor="accent6" w:themeShade="BF"/>
+        </w:rPr>
+        <w:t>arg</w:t>
+      </w:r>
+      <w:proofErr w:type="spellEnd"/>
+      <w:r>
+        <w:rPr>
+          <w:color w:val="538135" w:themeColor="accent6" w:themeShade="BF"/>
+        </w:rPr>
+        <w:t xml:space="preserve">&gt; </w:t>
+      </w:r>
+      <w:r>
+        <w:rPr>
+          <w:color w:val="7B7B7B" w:themeColor="accent3" w:themeShade="BF"/>
+        </w:rPr>
+        <w:t>-</w:t>
+      </w:r>
+      <w:proofErr w:type="spellStart"/>
+      <w:r>
+        <w:rPr>
+          <w:color w:val="7B7B7B" w:themeColor="accent3" w:themeShade="BF"/>
+        </w:rPr>
+        <w:t>i</w:t>
+      </w:r>
+      <w:proofErr w:type="spellEnd"/>
+      <w:r>
+        <w:rPr>
+          <w:color w:val="7B7B7B" w:themeColor="accent3" w:themeShade="BF"/>
+        </w:rPr>
+        <w:t xml:space="preserve"> &lt;</w:t>
+      </w:r>
+      <w:proofErr w:type="spellStart"/>
+      <w:r>
+        <w:rPr>
+          <w:color w:val="7B7B7B" w:themeColor="accent3" w:themeShade="BF"/>
+        </w:rPr>
+        <w:t>arg</w:t>
+      </w:r>
+      <w:proofErr w:type="spellEnd"/>
+      <w:r>
+        <w:rPr>
+          <w:color w:val="7B7B7B" w:themeColor="accent3" w:themeShade="BF"/>
+        </w:rPr>
+        <w:t xml:space="preserve">&gt; </w:t>
+      </w:r>
+      <w:r>
+        <w:t>[-l &lt;</w:t>
+      </w:r>
+      <w:proofErr w:type="spellStart"/>
+      <w:r>
+        <w:t>arg</w:t>
+      </w:r>
+      <w:proofErr w:type="spellEnd"/>
+      <w:r>
+        <w:t xml:space="preserve">&gt;] </w:t>
+      </w:r>
+      <w:r>
+        <w:rPr>
+          <w:color w:val="2F5496" w:themeColor="accent5" w:themeShade="BF"/>
+        </w:rPr>
+        <w:t>-o &lt;</w:t>
+      </w:r>
+      <w:proofErr w:type="spellStart"/>
+      <w:r>
+        <w:rPr>
+          <w:color w:val="2F5496" w:themeColor="accent5" w:themeShade="BF"/>
+        </w:rPr>
+        <w:t>arg</w:t>
+      </w:r>
+      <w:proofErr w:type="spellEnd"/>
+      <w:r>
+        <w:rPr>
+          <w:color w:val="2F5496" w:themeColor="accent5" w:themeShade="BF"/>
+        </w:rPr>
+        <w:t>&gt;</w:t>
+      </w:r>
+      <w:r>
+        <w:t xml:space="preserve"> </w:t>
+      </w:r>
+      <w:r>
+        <w:rPr>
+          <w:color w:val="FF3300"/>
+        </w:rPr>
+        <w:t>[-t &lt;</w:t>
+      </w:r>
+      <w:proofErr w:type="spellStart"/>
+      <w:r>
+        <w:rPr>
+          <w:color w:val="FF3300"/>
+        </w:rPr>
+        <w:t>arg</w:t>
+      </w:r>
+      <w:proofErr w:type="spellEnd"/>
+      <w:r>
+        <w:rPr>
+          <w:color w:val="FF3300"/>
+        </w:rPr>
+        <w:t>&gt;]</w:t>
+      </w:r>
+    </w:p>
+    <w:p>
+      <w:pPr>
+        <w:spacing w:after="120"/>
+        <w:rPr>
+          <w:color w:val="FF3300"/>
+        </w:rPr>
+      </w:pPr>
+    </w:p>
+    <w:p>
+      <w:pPr>
+        <w:rPr>
+          <w:b/>
+        </w:rPr>
+      </w:pPr>
+      <w:r>
+        <w:rPr>
+          <w:b/>
+        </w:rPr>
+        <w:t>Update external resources</w:t>
+      </w:r>
+    </w:p>
+    <w:p>
+      <w:pPr>
+        <w:spacing w:after="120"/>
+        <w:rPr>
+          <w:color w:val="BF8F00" w:themeColor="accent4" w:themeShade="BF"/>
+        </w:rPr>
+      </w:pPr>
+      <w:r>
+        <w:t xml:space="preserve">[directory\] </w:t>
+      </w:r>
+      <w:r>
+        <w:rPr>
+          <w:i/>
+        </w:rPr>
+        <w:t>java -jar octopus.jar</w:t>
+      </w:r>
+      <w:r>
+        <w:t xml:space="preserve"> </w:t>
+      </w:r>
+      <w:r>
+        <w:rPr>
+          <w:color w:val="BF8F00" w:themeColor="accent4" w:themeShade="BF"/>
+        </w:rPr>
+        <w:t>–</w:t>
+      </w:r>
+      <w:r>
+        <w:rPr>
+          <w:color w:val="BF8F00" w:themeColor="accent4" w:themeShade="BF"/>
+        </w:rPr>
+        <w:t>update</w:t>
+      </w:r>
+    </w:p>
+    <w:p>
+      <w:pPr>
+        <w:spacing w:after="120"/>
+        <w:rPr>
+          <w:color w:val="FF3300"/>
+        </w:rPr>
+      </w:pPr>
+      <w:r>
+        <w:t>where</w:t>
+      </w:r>
+      <w:r>
+        <w:t xml:space="preserve"> [directory\] is the optional java</w:t>
+      </w:r>
+      <w:r>
+        <w:t xml:space="preserve"> binary</w:t>
+      </w:r>
+      <w:r>
+        <w:t xml:space="preserve"> location, depending on your Java installation</w:t>
+      </w:r>
+      <w:r>
+        <w:t>:</w:t>
+      </w:r>
+    </w:p>
+    <w:p>
+      <w:r>
+        <w:t xml:space="preserve">In the "standalone" version, the directory is </w:t>
       </w:r>
       <w:proofErr w:type="gramStart"/>
       <w:r>
-        <w:rPr>
-          <w:b/>
-        </w:rPr>
-        <w:t>directory</w:t>
+        <w:t>`.\</w:t>
+      </w:r>
+      <w:proofErr w:type="spellStart"/>
+      <w:r>
+        <w:t>jre</w:t>
+      </w:r>
+      <w:proofErr w:type="spellEnd"/>
+      <w:r>
+        <w:t>\bin\</w:t>
       </w:r>
       <w:proofErr w:type="gramEnd"/>
-    </w:p>
-    <w:p>
-      <w:pPr>
-        <w:spacing w:after="120"/>
-        <w:rPr>
-          <w:color w:val="FF3300"/>
-        </w:rPr>
-      </w:pPr>
-      <w:r>
-        <w:t xml:space="preserve">[directory\] </w:t>
+      <w:r>
+        <w:t>`. If you already have Java installed, no directory is needed.</w:t>
+      </w:r>
+    </w:p>
+    <w:p>
+      <w:pPr>
+        <w:rPr>
+          <w:lang w:val="en-US"/>
+        </w:rPr>
+      </w:pPr>
+      <w:r>
+        <w:rPr>
+          <w:lang w:val="en-US"/>
+        </w:rPr>
+        <w:t xml:space="preserve">In </w:t>
       </w:r>
       <w:r>
         <w:rPr>
           <w:i/>
-        </w:rPr>
-        <w:t xml:space="preserve">java -jar octopus.jar </w:t>
-      </w:r>
-      <w:r>
-        <w:rPr>
-          <w:color w:val="CC00FF"/>
-        </w:rPr>
-        <w:t>[-c &lt;</w:t>
+          <w:lang w:val="en-US"/>
+        </w:rPr>
+        <w:t>[</w:t>
       </w:r>
       <w:proofErr w:type="spellStart"/>
       <w:r>
         <w:rPr>
-          <w:color w:val="CC00FF"/>
-        </w:rPr>
-        <w:t>arg</w:t>
+          <w:i/>
+          <w:lang w:val="en-US"/>
+        </w:rPr>
+        <w:t>octopus_install_folder</w:t>
       </w:r>
       <w:proofErr w:type="spellEnd"/>
       <w:r>
         <w:rPr>
-          <w:color w:val="CC00FF"/>
-        </w:rPr>
-        <w:t xml:space="preserve">&gt;] </w:t>
-      </w:r>
-      <w:r>
-        <w:rPr>
-          <w:color w:val="538135" w:themeColor="accent6" w:themeShade="BF"/>
-        </w:rPr>
-        <w:t>-f &lt;</w:t>
-      </w:r>
-      <w:proofErr w:type="spellStart"/>
-      <w:r>
-        <w:rPr>
-          <w:color w:val="538135" w:themeColor="accent6" w:themeShade="BF"/>
-        </w:rPr>
-        <w:t>arg</w:t>
-      </w:r>
-      <w:proofErr w:type="spellEnd"/>
-      <w:r>
-        <w:rPr>
-          <w:color w:val="538135" w:themeColor="accent6" w:themeShade="BF"/>
-        </w:rPr>
-        <w:t xml:space="preserve">&gt; </w:t>
-      </w:r>
-      <w:r>
-        <w:rPr>
-          <w:color w:val="7B7B7B" w:themeColor="accent3" w:themeShade="BF"/>
-        </w:rPr>
-        <w:t>-</w:t>
-      </w:r>
-      <w:proofErr w:type="spellStart"/>
-      <w:r>
-        <w:rPr>
-          <w:color w:val="7B7B7B" w:themeColor="accent3" w:themeShade="BF"/>
-        </w:rPr>
-        <w:t>i</w:t>
-      </w:r>
-      <w:proofErr w:type="spellEnd"/>
-      <w:r>
-        <w:rPr>
-          <w:color w:val="7B7B7B" w:themeColor="accent3" w:themeShade="BF"/>
-        </w:rPr>
-        <w:t xml:space="preserve"> &lt;</w:t>
-      </w:r>
-      <w:proofErr w:type="spellStart"/>
-      <w:r>
-        <w:rPr>
-          <w:color w:val="7B7B7B" w:themeColor="accent3" w:themeShade="BF"/>
-        </w:rPr>
-        <w:t>arg</w:t>
-      </w:r>
-      <w:proofErr w:type="spellEnd"/>
-      <w:r>
-        <w:rPr>
-          <w:color w:val="7B7B7B" w:themeColor="accent3" w:themeShade="BF"/>
-        </w:rPr>
-        <w:t xml:space="preserve">&gt; </w:t>
-      </w:r>
-      <w:r>
-        <w:t>[-l &lt;</w:t>
-      </w:r>
-      <w:proofErr w:type="spellStart"/>
-      <w:r>
-        <w:t>arg</w:t>
-      </w:r>
-      <w:proofErr w:type="spellEnd"/>
-      <w:r>
-        <w:t xml:space="preserve">&gt;] </w:t>
-      </w:r>
-      <w:r>
-        <w:rPr>
-          <w:color w:val="2F5496" w:themeColor="accent5" w:themeShade="BF"/>
-        </w:rPr>
-        <w:t>-o &lt;</w:t>
-      </w:r>
-      <w:proofErr w:type="spellStart"/>
-      <w:r>
-        <w:rPr>
-          <w:color w:val="2F5496" w:themeColor="accent5" w:themeShade="BF"/>
-        </w:rPr>
-        <w:t>arg</w:t>
-      </w:r>
-      <w:proofErr w:type="spellEnd"/>
-      <w:r>
-        <w:rPr>
-          <w:color w:val="2F5496" w:themeColor="accent5" w:themeShade="BF"/>
-        </w:rPr>
-        <w:t>&gt;</w:t>
-      </w:r>
-      <w:r>
-        <w:t xml:space="preserve"> </w:t>
-      </w:r>
-      <w:r>
-        <w:rPr>
-          <w:color w:val="FF3300"/>
-        </w:rPr>
-        <w:t>[-t &lt;</w:t>
-      </w:r>
-      <w:proofErr w:type="spellStart"/>
-      <w:r>
-        <w:rPr>
-          <w:color w:val="FF3300"/>
-        </w:rPr>
-        <w:t>arg</w:t>
-      </w:r>
-      <w:proofErr w:type="spellEnd"/>
-      <w:r>
-        <w:rPr>
-          <w:color w:val="FF3300"/>
-        </w:rPr>
-        <w:t>&gt;]</w:t>
-      </w:r>
-    </w:p>
-    <w:p>
-      <w:pPr>
-        <w:spacing w:after="120"/>
-        <w:rPr>
-          <w:color w:val="FF3300"/>
-        </w:rPr>
-      </w:pPr>
-    </w:p>
-    <w:p>
-      <w:pPr>
-        <w:rPr>
-          <w:b/>
-        </w:rPr>
-      </w:pPr>
-      <w:r>
-        <w:rPr>
-          <w:b/>
-        </w:rPr>
-        <w:t xml:space="preserve">Update external </w:t>
-      </w:r>
-      <w:proofErr w:type="gramStart"/>
-      <w:r>
-        <w:rPr>
-          <w:b/>
-        </w:rPr>
-        <w:t>resources</w:t>
-      </w:r>
-      <w:proofErr w:type="gramEnd"/>
-    </w:p>
-    <w:p>
-      <w:pPr>
-        <w:spacing w:after="120"/>
-        <w:rPr>
-          <w:color w:val="BF8F00" w:themeColor="accent4" w:themeShade="BF"/>
-        </w:rPr>
-      </w:pPr>
-      <w:r>
-        <w:t xml:space="preserve">[directory\] </w:t>
-      </w:r>
-      <w:r>
-        <w:rPr>
           <w:i/>
-        </w:rPr>
-        <w:t>java -jar octopus.jar</w:t>
-      </w:r>
-      <w:r>
-        <w:t xml:space="preserve"> </w:t>
-      </w:r>
-      <w:r>
-        <w:rPr>
-          <w:color w:val="BF8F00" w:themeColor="accent4" w:themeShade="BF"/>
-        </w:rPr>
-        <w:t>–</w:t>
-      </w:r>
-      <w:r>
-        <w:rPr>
-          <w:color w:val="BF8F00" w:themeColor="accent4" w:themeShade="BF"/>
-        </w:rPr>
-        <w:t>update</w:t>
-      </w:r>
-    </w:p>
-    <w:p>
-      <w:pPr>
-        <w:spacing w:after="120"/>
-        <w:rPr>
-          <w:color w:val="FF3300"/>
-        </w:rPr>
-      </w:pPr>
-      <w:r>
-        <w:t>where</w:t>
-      </w:r>
-      <w:r>
-        <w:t xml:space="preserve"> [directory\] is the optional java</w:t>
-      </w:r>
-      <w:r>
-        <w:t xml:space="preserve"> binary</w:t>
-      </w:r>
-      <w:r>
-        <w:t xml:space="preserve"> location, depending on your Java installation</w:t>
-      </w:r>
-      <w:r>
-        <w:t>:</w:t>
-      </w:r>
-    </w:p>
-    <w:p>
-      <w:r>
-        <w:t xml:space="preserve">In the "standalone" version, the directory is </w:t>
-      </w:r>
-      <w:proofErr w:type="gramStart"/>
-      <w:r>
-        <w:t>`.\</w:t>
-      </w:r>
-      <w:proofErr w:type="spellStart"/>
-      <w:r>
-        <w:t>jre</w:t>
-      </w:r>
-      <w:proofErr w:type="spellEnd"/>
-      <w:r>
-        <w:t>\bin\</w:t>
-      </w:r>
-      <w:proofErr w:type="gramEnd"/>
-      <w:r>
-        <w:t>`. If you already have Java installed, no directory is needed.</w:t>
-      </w:r>
-    </w:p>
-    <w:p>
-      <w:pPr>
-        <w:rPr>
-          <w:lang w:val="en-US"/>
-        </w:rPr>
-      </w:pPr>
-      <w:r>
-        <w:rPr>
-          <w:lang w:val="en-US"/>
-        </w:rPr>
-        <w:t xml:space="preserve">In </w:t>
+          <w:lang w:val="en-US"/>
+        </w:rPr>
+        <w:t>]/logs</w:t>
       </w:r>
       <w:r>
         <w:rPr>
           <w:i/>
           <w:lang w:val="en-US"/>
         </w:rPr>
-        <w:t>[</w:t>
-      </w:r>
-      <w:proofErr w:type="spellStart"/>
-      <w:r>
-        <w:rPr>
-          <w:i/>
-          <w:lang w:val="en-US"/>
-        </w:rPr>
-        <w:t>octopus_install_folder</w:t>
-      </w:r>
-      <w:proofErr w:type="spellEnd"/>
-      <w:r>
-        <w:rPr>
-          <w:i/>
-          <w:lang w:val="en-US"/>
-        </w:rPr>
-        <w:t>]/logs</w:t>
-      </w:r>
-      <w:r>
-        <w:rPr>
-          <w:i/>
-          <w:lang w:val="en-US"/>
-        </w:rPr>
         <w:t xml:space="preserve">, </w:t>
       </w:r>
       <w:r>
@@ -12780,19 +12897,11 @@
         </w:rPr>
         <w:t xml:space="preserve">in batch mode </w:t>
       </w:r>
-      <w:proofErr w:type="gramStart"/>
-      <w:r>
-        <w:rPr>
-          <w:lang w:val="en-US"/>
-        </w:rPr>
-        <w:t>generates also</w:t>
-      </w:r>
-      <w:proofErr w:type="gramEnd"/>
-      <w:r>
-        <w:rPr>
-          <w:lang w:val="en-US"/>
-        </w:rPr>
-        <w:t xml:space="preserve"> a log file using JSON format, which can be easily read by a software.</w:t>
+      <w:r>
+        <w:rPr>
+          <w:lang w:val="en-US"/>
+        </w:rPr>
+        <w:t>generates also a log file using JSON format, which can be easily read by a software.</w:t>
       </w:r>
     </w:p>
     <w:p>
@@ -13042,7 +13151,6 @@
               <w:t xml:space="preserve">list of LOCAL_CDI_IDs, </w:t>
             </w:r>
             <w:proofErr w:type="spellStart"/>
-            <w:proofErr w:type="gramStart"/>
             <w:r>
               <w:rPr>
                 <w:color w:val="CC00FF"/>
@@ -13051,7 +13159,6 @@
               <w:t>eg</w:t>
             </w:r>
             <w:proofErr w:type="spellEnd"/>
-            <w:proofErr w:type="gramEnd"/>
             <w:r>
               <w:rPr>
                 <w:color w:val="CC00FF"/>
@@ -14018,17 +14125,8 @@
           <w:color w:val="5B7591"/>
           <w:lang w:val="en-US"/>
         </w:rPr>
-        <w:t xml:space="preserve"> </w:t>
-      </w:r>
-      <w:proofErr w:type="gramStart"/>
-      <w:r>
-        <w:rPr>
-          <w:color w:val="5B7591"/>
-          <w:lang w:val="en-US"/>
-        </w:rPr>
-        <w:t>files</w:t>
-      </w:r>
-      <w:proofErr w:type="gramEnd"/>
+        <w:t xml:space="preserve"> files</w:t>
+      </w:r>
     </w:p>
     <w:p>
       <w:pPr>
@@ -14816,7 +14914,7 @@
 </file>
 
 <file path=word/endnotes.xml><?xml version="1.0" encoding="utf-8"?>
-<w:endnotes xmlns:wpc="http://schemas.microsoft.com/office/word/2010/wordprocessingCanvas" xmlns:cx="http://schemas.microsoft.com/office/drawing/2014/chartex" xmlns:cx1="http://schemas.microsoft.com/office/drawing/2015/9/8/chartex" xmlns:cx2="http://schemas.microsoft.com/office/drawing/2015/10/21/chartex" xmlns:cx3="http://schemas.microsoft.com/office/drawing/2016/5/9/chartex" xmlns:cx4="http://schemas.microsoft.com/office/drawing/2016/5/10/chartex" xmlns:cx5="http://schemas.microsoft.com/office/drawing/2016/5/11/chartex" xmlns:cx6="http://schemas.microsoft.com/office/drawing/2016/5/12/chartex" xmlns:cx7="http://schemas.microsoft.com/office/drawing/2016/5/13/chartex" xmlns:cx8="http://schemas.microsoft.com/office/drawing/2016/5/14/chartex" xmlns:mc="http://schemas.openxmlformats.org/markup-compatibility/2006" xmlns:aink="http://schemas.microsoft.com/office/drawing/2016/ink" xmlns:am3d="http://schemas.microsoft.com/office/drawing/2017/model3d" xmlns:o="urn:schemas-microsoft-com:office:office" xmlns:oel="http://schemas.microsoft.com/office/2019/extlst" xmlns:r="http://schemas.openxmlformats.org/officeDocument/2006/relationships" xmlns:m="http://schemas.openxmlformats.org/officeDocument/2006/math" xmlns:v="urn:schemas-microsoft-com:vml" xmlns:wp14="http://schemas.microsoft.com/office/word/2010/wordprocessingDrawing" xmlns:wp="http://schemas.openxmlformats.org/drawingml/2006/wordprocessingDrawing" xmlns:w10="urn:schemas-microsoft-com:office:word" xmlns:w="http://schemas.openxmlformats.org/wordprocessingml/2006/main" xmlns:w14="http://schemas.microsoft.com/office/word/2010/wordml" xmlns:w15="http://schemas.microsoft.com/office/word/2012/wordml" xmlns:w16cex="http://schemas.microsoft.com/office/word/2018/wordml/cex" xmlns:w16cid="http://schemas.microsoft.com/office/word/2016/wordml/cid" xmlns:w16="http://schemas.microsoft.com/office/word/2018/wordml" xmlns:w16sdtdh="http://schemas.microsoft.com/office/word/2020/wordml/sdtdatahash" xmlns:w16se="http://schemas.microsoft.com/office/word/2015/wordml/symex" xmlns:wpg="http://schemas.microsoft.com/office/word/2010/wordprocessingGroup" xmlns:wpi="http://schemas.microsoft.com/office/word/2010/wordprocessingInk" xmlns:wne="http://schemas.microsoft.com/office/word/2006/wordml" xmlns:wps="http://schemas.microsoft.com/office/word/2010/wordprocessingShape" mc:Ignorable="w14 w15 w16se w16cid w16 w16cex w16sdtdh wp14">
+<w:endnotes xmlns:wpc="http://schemas.microsoft.com/office/word/2010/wordprocessingCanvas" xmlns:cx="http://schemas.microsoft.com/office/drawing/2014/chartex" xmlns:cx1="http://schemas.microsoft.com/office/drawing/2015/9/8/chartex" xmlns:cx2="http://schemas.microsoft.com/office/drawing/2015/10/21/chartex" xmlns:cx3="http://schemas.microsoft.com/office/drawing/2016/5/9/chartex" xmlns:cx4="http://schemas.microsoft.com/office/drawing/2016/5/10/chartex" xmlns:cx5="http://schemas.microsoft.com/office/drawing/2016/5/11/chartex" xmlns:cx6="http://schemas.microsoft.com/office/drawing/2016/5/12/chartex" xmlns:cx7="http://schemas.microsoft.com/office/drawing/2016/5/13/chartex" xmlns:cx8="http://schemas.microsoft.com/office/drawing/2016/5/14/chartex" xmlns:mc="http://schemas.openxmlformats.org/markup-compatibility/2006" xmlns:aink="http://schemas.microsoft.com/office/drawing/2016/ink" xmlns:am3d="http://schemas.microsoft.com/office/drawing/2017/model3d" xmlns:o="urn:schemas-microsoft-com:office:office" xmlns:oel="http://schemas.microsoft.com/office/2019/extlst" xmlns:r="http://schemas.openxmlformats.org/officeDocument/2006/relationships" xmlns:m="http://schemas.openxmlformats.org/officeDocument/2006/math" xmlns:v="urn:schemas-microsoft-com:vml" xmlns:wp14="http://schemas.microsoft.com/office/word/2010/wordprocessingDrawing" xmlns:wp="http://schemas.openxmlformats.org/drawingml/2006/wordprocessingDrawing" xmlns:w10="urn:schemas-microsoft-com:office:word" xmlns:w="http://schemas.openxmlformats.org/wordprocessingml/2006/main" xmlns:w14="http://schemas.microsoft.com/office/word/2010/wordml" xmlns:w15="http://schemas.microsoft.com/office/word/2012/wordml" xmlns:w16cex="http://schemas.microsoft.com/office/word/2018/wordml/cex" xmlns:w16cid="http://schemas.microsoft.com/office/word/2016/wordml/cid" xmlns:w16="http://schemas.microsoft.com/office/word/2018/wordml" xmlns:w16du="http://schemas.microsoft.com/office/word/2023/wordml/word16du" xmlns:w16sdtdh="http://schemas.microsoft.com/office/word/2020/wordml/sdtdatahash" xmlns:w16se="http://schemas.microsoft.com/office/word/2015/wordml/symex" xmlns:wpg="http://schemas.microsoft.com/office/word/2010/wordprocessingGroup" xmlns:wpi="http://schemas.microsoft.com/office/word/2010/wordprocessingInk" xmlns:wne="http://schemas.microsoft.com/office/word/2006/wordml" xmlns:wps="http://schemas.microsoft.com/office/word/2010/wordprocessingShape" mc:Ignorable="w14 w15 w16se w16cid w16 w16cex w16sdtdh w16du wp14">
   <w:endnote w:type="separator" w:id="-1">
     <w:p>
       <w:r>
@@ -14835,7 +14933,7 @@
 </file>
 
 <file path=word/footer1.xml><?xml version="1.0" encoding="utf-8"?>
-<w:ftr xmlns:wpc="http://schemas.microsoft.com/office/word/2010/wordprocessingCanvas" xmlns:cx="http://schemas.microsoft.com/office/drawing/2014/chartex" xmlns:cx1="http://schemas.microsoft.com/office/drawing/2015/9/8/chartex" xmlns:cx2="http://schemas.microsoft.com/office/drawing/2015/10/21/chartex" xmlns:cx3="http://schemas.microsoft.com/office/drawing/2016/5/9/chartex" xmlns:cx4="http://schemas.microsoft.com/office/drawing/2016/5/10/chartex" xmlns:cx5="http://schemas.microsoft.com/office/drawing/2016/5/11/chartex" xmlns:cx6="http://schemas.microsoft.com/office/drawing/2016/5/12/chartex" xmlns:cx7="http://schemas.microsoft.com/office/drawing/2016/5/13/chartex" xmlns:cx8="http://schemas.microsoft.com/office/drawing/2016/5/14/chartex" xmlns:mc="http://schemas.openxmlformats.org/markup-compatibility/2006" xmlns:aink="http://schemas.microsoft.com/office/drawing/2016/ink" xmlns:am3d="http://schemas.microsoft.com/office/drawing/2017/model3d" xmlns:o="urn:schemas-microsoft-com:office:office" xmlns:oel="http://schemas.microsoft.com/office/2019/extlst" xmlns:r="http://schemas.openxmlformats.org/officeDocument/2006/relationships" xmlns:m="http://schemas.openxmlformats.org/officeDocument/2006/math" xmlns:v="urn:schemas-microsoft-com:vml" xmlns:wp14="http://schemas.microsoft.com/office/word/2010/wordprocessingDrawing" xmlns:wp="http://schemas.openxmlformats.org/drawingml/2006/wordprocessingDrawing" xmlns:w10="urn:schemas-microsoft-com:office:word" xmlns:w="http://schemas.openxmlformats.org/wordprocessingml/2006/main" xmlns:w14="http://schemas.microsoft.com/office/word/2010/wordml" xmlns:w15="http://schemas.microsoft.com/office/word/2012/wordml" xmlns:w16cex="http://schemas.microsoft.com/office/word/2018/wordml/cex" xmlns:w16cid="http://schemas.microsoft.com/office/word/2016/wordml/cid" xmlns:w16="http://schemas.microsoft.com/office/word/2018/wordml" xmlns:w16sdtdh="http://schemas.microsoft.com/office/word/2020/wordml/sdtdatahash" xmlns:w16se="http://schemas.microsoft.com/office/word/2015/wordml/symex" xmlns:wpg="http://schemas.microsoft.com/office/word/2010/wordprocessingGroup" xmlns:wpi="http://schemas.microsoft.com/office/word/2010/wordprocessingInk" xmlns:wne="http://schemas.microsoft.com/office/word/2006/wordml" xmlns:wps="http://schemas.microsoft.com/office/word/2010/wordprocessingShape" mc:Ignorable="w14 w15 w16se w16cid w16 w16cex w16sdtdh wp14">
+<w:ftr xmlns:wpc="http://schemas.microsoft.com/office/word/2010/wordprocessingCanvas" xmlns:cx="http://schemas.microsoft.com/office/drawing/2014/chartex" xmlns:cx1="http://schemas.microsoft.com/office/drawing/2015/9/8/chartex" xmlns:cx2="http://schemas.microsoft.com/office/drawing/2015/10/21/chartex" xmlns:cx3="http://schemas.microsoft.com/office/drawing/2016/5/9/chartex" xmlns:cx4="http://schemas.microsoft.com/office/drawing/2016/5/10/chartex" xmlns:cx5="http://schemas.microsoft.com/office/drawing/2016/5/11/chartex" xmlns:cx6="http://schemas.microsoft.com/office/drawing/2016/5/12/chartex" xmlns:cx7="http://schemas.microsoft.com/office/drawing/2016/5/13/chartex" xmlns:cx8="http://schemas.microsoft.com/office/drawing/2016/5/14/chartex" xmlns:mc="http://schemas.openxmlformats.org/markup-compatibility/2006" xmlns:aink="http://schemas.microsoft.com/office/drawing/2016/ink" xmlns:am3d="http://schemas.microsoft.com/office/drawing/2017/model3d" xmlns:o="urn:schemas-microsoft-com:office:office" xmlns:oel="http://schemas.microsoft.com/office/2019/extlst" xmlns:r="http://schemas.openxmlformats.org/officeDocument/2006/relationships" xmlns:m="http://schemas.openxmlformats.org/officeDocument/2006/math" xmlns:v="urn:schemas-microsoft-com:vml" xmlns:wp14="http://schemas.microsoft.com/office/word/2010/wordprocessingDrawing" xmlns:wp="http://schemas.openxmlformats.org/drawingml/2006/wordprocessingDrawing" xmlns:w10="urn:schemas-microsoft-com:office:word" xmlns:w="http://schemas.openxmlformats.org/wordprocessingml/2006/main" xmlns:w14="http://schemas.microsoft.com/office/word/2010/wordml" xmlns:w15="http://schemas.microsoft.com/office/word/2012/wordml" xmlns:w16cex="http://schemas.microsoft.com/office/word/2018/wordml/cex" xmlns:w16cid="http://schemas.microsoft.com/office/word/2016/wordml/cid" xmlns:w16="http://schemas.microsoft.com/office/word/2018/wordml" xmlns:w16du="http://schemas.microsoft.com/office/word/2023/wordml/word16du" xmlns:w16sdtdh="http://schemas.microsoft.com/office/word/2020/wordml/sdtdatahash" xmlns:w16se="http://schemas.microsoft.com/office/word/2015/wordml/symex" xmlns:wpg="http://schemas.microsoft.com/office/word/2010/wordprocessingGroup" xmlns:wpi="http://schemas.microsoft.com/office/word/2010/wordprocessingInk" xmlns:wne="http://schemas.microsoft.com/office/word/2006/wordml" xmlns:wps="http://schemas.microsoft.com/office/word/2010/wordprocessingShape" mc:Ignorable="w14 w15 w16se w16cid w16 w16cex w16sdtdh w16du wp14">
   <w:p>
     <w:pPr>
       <w:pStyle w:val="Pieddepage"/>
@@ -14861,7 +14959,7 @@
 </file>
 
 <file path=word/footer2.xml><?xml version="1.0" encoding="utf-8"?>
-<w:ftr xmlns:wpc="http://schemas.microsoft.com/office/word/2010/wordprocessingCanvas" xmlns:cx="http://schemas.microsoft.com/office/drawing/2014/chartex" xmlns:cx1="http://schemas.microsoft.com/office/drawing/2015/9/8/chartex" xmlns:cx2="http://schemas.microsoft.com/office/drawing/2015/10/21/chartex" xmlns:cx3="http://schemas.microsoft.com/office/drawing/2016/5/9/chartex" xmlns:cx4="http://schemas.microsoft.com/office/drawing/2016/5/10/chartex" xmlns:cx5="http://schemas.microsoft.com/office/drawing/2016/5/11/chartex" xmlns:cx6="http://schemas.microsoft.com/office/drawing/2016/5/12/chartex" xmlns:cx7="http://schemas.microsoft.com/office/drawing/2016/5/13/chartex" xmlns:cx8="http://schemas.microsoft.com/office/drawing/2016/5/14/chartex" xmlns:mc="http://schemas.openxmlformats.org/markup-compatibility/2006" xmlns:aink="http://schemas.microsoft.com/office/drawing/2016/ink" xmlns:am3d="http://schemas.microsoft.com/office/drawing/2017/model3d" xmlns:o="urn:schemas-microsoft-com:office:office" xmlns:oel="http://schemas.microsoft.com/office/2019/extlst" xmlns:r="http://schemas.openxmlformats.org/officeDocument/2006/relationships" xmlns:m="http://schemas.openxmlformats.org/officeDocument/2006/math" xmlns:v="urn:schemas-microsoft-com:vml" xmlns:wp14="http://schemas.microsoft.com/office/word/2010/wordprocessingDrawing" xmlns:wp="http://schemas.openxmlformats.org/drawingml/2006/wordprocessingDrawing" xmlns:w10="urn:schemas-microsoft-com:office:word" xmlns:w="http://schemas.openxmlformats.org/wordprocessingml/2006/main" xmlns:w14="http://schemas.microsoft.com/office/word/2010/wordml" xmlns:w15="http://schemas.microsoft.com/office/word/2012/wordml" xmlns:w16cex="http://schemas.microsoft.com/office/word/2018/wordml/cex" xmlns:w16cid="http://schemas.microsoft.com/office/word/2016/wordml/cid" xmlns:w16="http://schemas.microsoft.com/office/word/2018/wordml" xmlns:w16sdtdh="http://schemas.microsoft.com/office/word/2020/wordml/sdtdatahash" xmlns:w16se="http://schemas.microsoft.com/office/word/2015/wordml/symex" xmlns:wpg="http://schemas.microsoft.com/office/word/2010/wordprocessingGroup" xmlns:wpi="http://schemas.microsoft.com/office/word/2010/wordprocessingInk" xmlns:wne="http://schemas.microsoft.com/office/word/2006/wordml" xmlns:wps="http://schemas.microsoft.com/office/word/2010/wordprocessingShape" mc:Ignorable="w14 w15 w16se w16cid w16 w16cex w16sdtdh wp14">
+<w:ftr xmlns:wpc="http://schemas.microsoft.com/office/word/2010/wordprocessingCanvas" xmlns:cx="http://schemas.microsoft.com/office/drawing/2014/chartex" xmlns:cx1="http://schemas.microsoft.com/office/drawing/2015/9/8/chartex" xmlns:cx2="http://schemas.microsoft.com/office/drawing/2015/10/21/chartex" xmlns:cx3="http://schemas.microsoft.com/office/drawing/2016/5/9/chartex" xmlns:cx4="http://schemas.microsoft.com/office/drawing/2016/5/10/chartex" xmlns:cx5="http://schemas.microsoft.com/office/drawing/2016/5/11/chartex" xmlns:cx6="http://schemas.microsoft.com/office/drawing/2016/5/12/chartex" xmlns:cx7="http://schemas.microsoft.com/office/drawing/2016/5/13/chartex" xmlns:cx8="http://schemas.microsoft.com/office/drawing/2016/5/14/chartex" xmlns:mc="http://schemas.openxmlformats.org/markup-compatibility/2006" xmlns:aink="http://schemas.microsoft.com/office/drawing/2016/ink" xmlns:am3d="http://schemas.microsoft.com/office/drawing/2017/model3d" xmlns:o="urn:schemas-microsoft-com:office:office" xmlns:oel="http://schemas.microsoft.com/office/2019/extlst" xmlns:r="http://schemas.openxmlformats.org/officeDocument/2006/relationships" xmlns:m="http://schemas.openxmlformats.org/officeDocument/2006/math" xmlns:v="urn:schemas-microsoft-com:vml" xmlns:wp14="http://schemas.microsoft.com/office/word/2010/wordprocessingDrawing" xmlns:wp="http://schemas.openxmlformats.org/drawingml/2006/wordprocessingDrawing" xmlns:w10="urn:schemas-microsoft-com:office:word" xmlns:w="http://schemas.openxmlformats.org/wordprocessingml/2006/main" xmlns:w14="http://schemas.microsoft.com/office/word/2010/wordml" xmlns:w15="http://schemas.microsoft.com/office/word/2012/wordml" xmlns:w16cex="http://schemas.microsoft.com/office/word/2018/wordml/cex" xmlns:w16cid="http://schemas.microsoft.com/office/word/2016/wordml/cid" xmlns:w16="http://schemas.microsoft.com/office/word/2018/wordml" xmlns:w16du="http://schemas.microsoft.com/office/word/2023/wordml/word16du" xmlns:w16sdtdh="http://schemas.microsoft.com/office/word/2020/wordml/sdtdatahash" xmlns:w16se="http://schemas.microsoft.com/office/word/2015/wordml/symex" xmlns:wpg="http://schemas.microsoft.com/office/word/2010/wordprocessingGroup" xmlns:wpi="http://schemas.microsoft.com/office/word/2010/wordprocessingInk" xmlns:wne="http://schemas.microsoft.com/office/word/2006/wordml" xmlns:wps="http://schemas.microsoft.com/office/word/2010/wordprocessingShape" mc:Ignorable="w14 w15 w16se w16cid w16 w16cex w16sdtdh w16du wp14">
   <w:p>
     <w:pPr>
       <w:pStyle w:val="Pieddepage"/>
@@ -15120,7 +15218,7 @@
 </file>
 
 <file path=word/footer3.xml><?xml version="1.0" encoding="utf-8"?>
-<w:ftr xmlns:wpc="http://schemas.microsoft.com/office/word/2010/wordprocessingCanvas" xmlns:cx="http://schemas.microsoft.com/office/drawing/2014/chartex" xmlns:cx1="http://schemas.microsoft.com/office/drawing/2015/9/8/chartex" xmlns:cx2="http://schemas.microsoft.com/office/drawing/2015/10/21/chartex" xmlns:cx3="http://schemas.microsoft.com/office/drawing/2016/5/9/chartex" xmlns:cx4="http://schemas.microsoft.com/office/drawing/2016/5/10/chartex" xmlns:cx5="http://schemas.microsoft.com/office/drawing/2016/5/11/chartex" xmlns:cx6="http://schemas.microsoft.com/office/drawing/2016/5/12/chartex" xmlns:cx7="http://schemas.microsoft.com/office/drawing/2016/5/13/chartex" xmlns:cx8="http://schemas.microsoft.com/office/drawing/2016/5/14/chartex" xmlns:mc="http://schemas.openxmlformats.org/markup-compatibility/2006" xmlns:aink="http://schemas.microsoft.com/office/drawing/2016/ink" xmlns:am3d="http://schemas.microsoft.com/office/drawing/2017/model3d" xmlns:o="urn:schemas-microsoft-com:office:office" xmlns:oel="http://schemas.microsoft.com/office/2019/extlst" xmlns:r="http://schemas.openxmlformats.org/officeDocument/2006/relationships" xmlns:m="http://schemas.openxmlformats.org/officeDocument/2006/math" xmlns:v="urn:schemas-microsoft-com:vml" xmlns:wp14="http://schemas.microsoft.com/office/word/2010/wordprocessingDrawing" xmlns:wp="http://schemas.openxmlformats.org/drawingml/2006/wordprocessingDrawing" xmlns:w10="urn:schemas-microsoft-com:office:word" xmlns:w="http://schemas.openxmlformats.org/wordprocessingml/2006/main" xmlns:w14="http://schemas.microsoft.com/office/word/2010/wordml" xmlns:w15="http://schemas.microsoft.com/office/word/2012/wordml" xmlns:w16cex="http://schemas.microsoft.com/office/word/2018/wordml/cex" xmlns:w16cid="http://schemas.microsoft.com/office/word/2016/wordml/cid" xmlns:w16="http://schemas.microsoft.com/office/word/2018/wordml" xmlns:w16sdtdh="http://schemas.microsoft.com/office/word/2020/wordml/sdtdatahash" xmlns:w16se="http://schemas.microsoft.com/office/word/2015/wordml/symex" xmlns:wpg="http://schemas.microsoft.com/office/word/2010/wordprocessingGroup" xmlns:wpi="http://schemas.microsoft.com/office/word/2010/wordprocessingInk" xmlns:wne="http://schemas.microsoft.com/office/word/2006/wordml" xmlns:wps="http://schemas.microsoft.com/office/word/2010/wordprocessingShape" mc:Ignorable="w14 w15 w16se w16cid w16 w16cex w16sdtdh wp14">
+<w:ftr xmlns:wpc="http://schemas.microsoft.com/office/word/2010/wordprocessingCanvas" xmlns:cx="http://schemas.microsoft.com/office/drawing/2014/chartex" xmlns:cx1="http://schemas.microsoft.com/office/drawing/2015/9/8/chartex" xmlns:cx2="http://schemas.microsoft.com/office/drawing/2015/10/21/chartex" xmlns:cx3="http://schemas.microsoft.com/office/drawing/2016/5/9/chartex" xmlns:cx4="http://schemas.microsoft.com/office/drawing/2016/5/10/chartex" xmlns:cx5="http://schemas.microsoft.com/office/drawing/2016/5/11/chartex" xmlns:cx6="http://schemas.microsoft.com/office/drawing/2016/5/12/chartex" xmlns:cx7="http://schemas.microsoft.com/office/drawing/2016/5/13/chartex" xmlns:cx8="http://schemas.microsoft.com/office/drawing/2016/5/14/chartex" xmlns:mc="http://schemas.openxmlformats.org/markup-compatibility/2006" xmlns:aink="http://schemas.microsoft.com/office/drawing/2016/ink" xmlns:am3d="http://schemas.microsoft.com/office/drawing/2017/model3d" xmlns:o="urn:schemas-microsoft-com:office:office" xmlns:oel="http://schemas.microsoft.com/office/2019/extlst" xmlns:r="http://schemas.openxmlformats.org/officeDocument/2006/relationships" xmlns:m="http://schemas.openxmlformats.org/officeDocument/2006/math" xmlns:v="urn:schemas-microsoft-com:vml" xmlns:wp14="http://schemas.microsoft.com/office/word/2010/wordprocessingDrawing" xmlns:wp="http://schemas.openxmlformats.org/drawingml/2006/wordprocessingDrawing" xmlns:w10="urn:schemas-microsoft-com:office:word" xmlns:w="http://schemas.openxmlformats.org/wordprocessingml/2006/main" xmlns:w14="http://schemas.microsoft.com/office/word/2010/wordml" xmlns:w15="http://schemas.microsoft.com/office/word/2012/wordml" xmlns:w16cex="http://schemas.microsoft.com/office/word/2018/wordml/cex" xmlns:w16cid="http://schemas.microsoft.com/office/word/2016/wordml/cid" xmlns:w16="http://schemas.microsoft.com/office/word/2018/wordml" xmlns:w16du="http://schemas.microsoft.com/office/word/2023/wordml/word16du" xmlns:w16sdtdh="http://schemas.microsoft.com/office/word/2020/wordml/sdtdatahash" xmlns:w16se="http://schemas.microsoft.com/office/word/2015/wordml/symex" xmlns:wpg="http://schemas.microsoft.com/office/word/2010/wordprocessingGroup" xmlns:wpi="http://schemas.microsoft.com/office/word/2010/wordprocessingInk" xmlns:wne="http://schemas.microsoft.com/office/word/2006/wordml" xmlns:wps="http://schemas.microsoft.com/office/word/2010/wordprocessingShape" mc:Ignorable="w14 w15 w16se w16cid w16 w16cex w16sdtdh w16du wp14">
   <w:p>
     <w:pPr>
       <w:pStyle w:val="Pieddepage"/>
@@ -15285,7 +15383,7 @@
 </file>
 
 <file path=word/footnotes.xml><?xml version="1.0" encoding="utf-8"?>
-<w:footnotes xmlns:wpc="http://schemas.microsoft.com/office/word/2010/wordprocessingCanvas" xmlns:cx="http://schemas.microsoft.com/office/drawing/2014/chartex" xmlns:cx1="http://schemas.microsoft.com/office/drawing/2015/9/8/chartex" xmlns:cx2="http://schemas.microsoft.com/office/drawing/2015/10/21/chartex" xmlns:cx3="http://schemas.microsoft.com/office/drawing/2016/5/9/chartex" xmlns:cx4="http://schemas.microsoft.com/office/drawing/2016/5/10/chartex" xmlns:cx5="http://schemas.microsoft.com/office/drawing/2016/5/11/chartex" xmlns:cx6="http://schemas.microsoft.com/office/drawing/2016/5/12/chartex" xmlns:cx7="http://schemas.microsoft.com/office/drawing/2016/5/13/chartex" xmlns:cx8="http://schemas.microsoft.com/office/drawing/2016/5/14/chartex" xmlns:mc="http://schemas.openxmlformats.org/markup-compatibility/2006" xmlns:aink="http://schemas.microsoft.com/office/drawing/2016/ink" xmlns:am3d="http://schemas.microsoft.com/office/drawing/2017/model3d" xmlns:o="urn:schemas-microsoft-com:office:office" xmlns:oel="http://schemas.microsoft.com/office/2019/extlst" xmlns:r="http://schemas.openxmlformats.org/officeDocument/2006/relationships" xmlns:m="http://schemas.openxmlformats.org/officeDocument/2006/math" xmlns:v="urn:schemas-microsoft-com:vml" xmlns:wp14="http://schemas.microsoft.com/office/word/2010/wordprocessingDrawing" xmlns:wp="http://schemas.openxmlformats.org/drawingml/2006/wordprocessingDrawing" xmlns:w10="urn:schemas-microsoft-com:office:word" xmlns:w="http://schemas.openxmlformats.org/wordprocessingml/2006/main" xmlns:w14="http://schemas.microsoft.com/office/word/2010/wordml" xmlns:w15="http://schemas.microsoft.com/office/word/2012/wordml" xmlns:w16cex="http://schemas.microsoft.com/office/word/2018/wordml/cex" xmlns:w16cid="http://schemas.microsoft.com/office/word/2016/wordml/cid" xmlns:w16="http://schemas.microsoft.com/office/word/2018/wordml" xmlns:w16sdtdh="http://schemas.microsoft.com/office/word/2020/wordml/sdtdatahash" xmlns:w16se="http://schemas.microsoft.com/office/word/2015/wordml/symex" xmlns:wpg="http://schemas.microsoft.com/office/word/2010/wordprocessingGroup" xmlns:wpi="http://schemas.microsoft.com/office/word/2010/wordprocessingInk" xmlns:wne="http://schemas.microsoft.com/office/word/2006/wordml" xmlns:wps="http://schemas.microsoft.com/office/word/2010/wordprocessingShape" mc:Ignorable="w14 w15 w16se w16cid w16 w16cex w16sdtdh wp14">
+<w:footnotes xmlns:wpc="http://schemas.microsoft.com/office/word/2010/wordprocessingCanvas" xmlns:cx="http://schemas.microsoft.com/office/drawing/2014/chartex" xmlns:cx1="http://schemas.microsoft.com/office/drawing/2015/9/8/chartex" xmlns:cx2="http://schemas.microsoft.com/office/drawing/2015/10/21/chartex" xmlns:cx3="http://schemas.microsoft.com/office/drawing/2016/5/9/chartex" xmlns:cx4="http://schemas.microsoft.com/office/drawing/2016/5/10/chartex" xmlns:cx5="http://schemas.microsoft.com/office/drawing/2016/5/11/chartex" xmlns:cx6="http://schemas.microsoft.com/office/drawing/2016/5/12/chartex" xmlns:cx7="http://schemas.microsoft.com/office/drawing/2016/5/13/chartex" xmlns:cx8="http://schemas.microsoft.com/office/drawing/2016/5/14/chartex" xmlns:mc="http://schemas.openxmlformats.org/markup-compatibility/2006" xmlns:aink="http://schemas.microsoft.com/office/drawing/2016/ink" xmlns:am3d="http://schemas.microsoft.com/office/drawing/2017/model3d" xmlns:o="urn:schemas-microsoft-com:office:office" xmlns:oel="http://schemas.microsoft.com/office/2019/extlst" xmlns:r="http://schemas.openxmlformats.org/officeDocument/2006/relationships" xmlns:m="http://schemas.openxmlformats.org/officeDocument/2006/math" xmlns:v="urn:schemas-microsoft-com:vml" xmlns:wp14="http://schemas.microsoft.com/office/word/2010/wordprocessingDrawing" xmlns:wp="http://schemas.openxmlformats.org/drawingml/2006/wordprocessingDrawing" xmlns:w10="urn:schemas-microsoft-com:office:word" xmlns:w="http://schemas.openxmlformats.org/wordprocessingml/2006/main" xmlns:w14="http://schemas.microsoft.com/office/word/2010/wordml" xmlns:w15="http://schemas.microsoft.com/office/word/2012/wordml" xmlns:w16cex="http://schemas.microsoft.com/office/word/2018/wordml/cex" xmlns:w16cid="http://schemas.microsoft.com/office/word/2016/wordml/cid" xmlns:w16="http://schemas.microsoft.com/office/word/2018/wordml" xmlns:w16du="http://schemas.microsoft.com/office/word/2023/wordml/word16du" xmlns:w16sdtdh="http://schemas.microsoft.com/office/word/2020/wordml/sdtdatahash" xmlns:w16se="http://schemas.microsoft.com/office/word/2015/wordml/symex" xmlns:wpg="http://schemas.microsoft.com/office/word/2010/wordprocessingGroup" xmlns:wpi="http://schemas.microsoft.com/office/word/2010/wordprocessingInk" xmlns:wne="http://schemas.microsoft.com/office/word/2006/wordml" xmlns:wps="http://schemas.microsoft.com/office/word/2010/wordprocessingShape" mc:Ignorable="w14 w15 w16se w16cid w16 w16cex w16sdtdh w16du wp14">
   <w:footnote w:type="separator" w:id="-1">
     <w:p>
       <w:r>
@@ -15304,7 +15402,7 @@
 </file>
 
 <file path=word/header1.xml><?xml version="1.0" encoding="utf-8"?>
-<w:hdr xmlns:wpc="http://schemas.microsoft.com/office/word/2010/wordprocessingCanvas" xmlns:cx="http://schemas.microsoft.com/office/drawing/2014/chartex" xmlns:cx1="http://schemas.microsoft.com/office/drawing/2015/9/8/chartex" xmlns:cx2="http://schemas.microsoft.com/office/drawing/2015/10/21/chartex" xmlns:cx3="http://schemas.microsoft.com/office/drawing/2016/5/9/chartex" xmlns:cx4="http://schemas.microsoft.com/office/drawing/2016/5/10/chartex" xmlns:cx5="http://schemas.microsoft.com/office/drawing/2016/5/11/chartex" xmlns:cx6="http://schemas.microsoft.com/office/drawing/2016/5/12/chartex" xmlns:cx7="http://schemas.microsoft.com/office/drawing/2016/5/13/chartex" xmlns:cx8="http://schemas.microsoft.com/office/drawing/2016/5/14/chartex" xmlns:mc="http://schemas.openxmlformats.org/markup-compatibility/2006" xmlns:aink="http://schemas.microsoft.com/office/drawing/2016/ink" xmlns:am3d="http://schemas.microsoft.com/office/drawing/2017/model3d" xmlns:o="urn:schemas-microsoft-com:office:office" xmlns:oel="http://schemas.microsoft.com/office/2019/extlst" xmlns:r="http://schemas.openxmlformats.org/officeDocument/2006/relationships" xmlns:m="http://schemas.openxmlformats.org/officeDocument/2006/math" xmlns:v="urn:schemas-microsoft-com:vml" xmlns:wp14="http://schemas.microsoft.com/office/word/2010/wordprocessingDrawing" xmlns:wp="http://schemas.openxmlformats.org/drawingml/2006/wordprocessingDrawing" xmlns:w10="urn:schemas-microsoft-com:office:word" xmlns:w="http://schemas.openxmlformats.org/wordprocessingml/2006/main" xmlns:w14="http://schemas.microsoft.com/office/word/2010/wordml" xmlns:w15="http://schemas.microsoft.com/office/word/2012/wordml" xmlns:w16cex="http://schemas.microsoft.com/office/word/2018/wordml/cex" xmlns:w16cid="http://schemas.microsoft.com/office/word/2016/wordml/cid" xmlns:w16="http://schemas.microsoft.com/office/word/2018/wordml" xmlns:w16sdtdh="http://schemas.microsoft.com/office/word/2020/wordml/sdtdatahash" xmlns:w16se="http://schemas.microsoft.com/office/word/2015/wordml/symex" xmlns:wpg="http://schemas.microsoft.com/office/word/2010/wordprocessingGroup" xmlns:wpi="http://schemas.microsoft.com/office/word/2010/wordprocessingInk" xmlns:wne="http://schemas.microsoft.com/office/word/2006/wordml" xmlns:wps="http://schemas.microsoft.com/office/word/2010/wordprocessingShape" mc:Ignorable="w14 w15 w16se w16cid w16 w16cex w16sdtdh wp14">
+<w:hdr xmlns:wpc="http://schemas.microsoft.com/office/word/2010/wordprocessingCanvas" xmlns:cx="http://schemas.microsoft.com/office/drawing/2014/chartex" xmlns:cx1="http://schemas.microsoft.com/office/drawing/2015/9/8/chartex" xmlns:cx2="http://schemas.microsoft.com/office/drawing/2015/10/21/chartex" xmlns:cx3="http://schemas.microsoft.com/office/drawing/2016/5/9/chartex" xmlns:cx4="http://schemas.microsoft.com/office/drawing/2016/5/10/chartex" xmlns:cx5="http://schemas.microsoft.com/office/drawing/2016/5/11/chartex" xmlns:cx6="http://schemas.microsoft.com/office/drawing/2016/5/12/chartex" xmlns:cx7="http://schemas.microsoft.com/office/drawing/2016/5/13/chartex" xmlns:cx8="http://schemas.microsoft.com/office/drawing/2016/5/14/chartex" xmlns:mc="http://schemas.openxmlformats.org/markup-compatibility/2006" xmlns:aink="http://schemas.microsoft.com/office/drawing/2016/ink" xmlns:am3d="http://schemas.microsoft.com/office/drawing/2017/model3d" xmlns:o="urn:schemas-microsoft-com:office:office" xmlns:oel="http://schemas.microsoft.com/office/2019/extlst" xmlns:r="http://schemas.openxmlformats.org/officeDocument/2006/relationships" xmlns:m="http://schemas.openxmlformats.org/officeDocument/2006/math" xmlns:v="urn:schemas-microsoft-com:vml" xmlns:wp14="http://schemas.microsoft.com/office/word/2010/wordprocessingDrawing" xmlns:wp="http://schemas.openxmlformats.org/drawingml/2006/wordprocessingDrawing" xmlns:w10="urn:schemas-microsoft-com:office:word" xmlns:w="http://schemas.openxmlformats.org/wordprocessingml/2006/main" xmlns:w14="http://schemas.microsoft.com/office/word/2010/wordml" xmlns:w15="http://schemas.microsoft.com/office/word/2012/wordml" xmlns:w16cex="http://schemas.microsoft.com/office/word/2018/wordml/cex" xmlns:w16cid="http://schemas.microsoft.com/office/word/2016/wordml/cid" xmlns:w16="http://schemas.microsoft.com/office/word/2018/wordml" xmlns:w16du="http://schemas.microsoft.com/office/word/2023/wordml/word16du" xmlns:w16sdtdh="http://schemas.microsoft.com/office/word/2020/wordml/sdtdatahash" xmlns:w16se="http://schemas.microsoft.com/office/word/2015/wordml/symex" xmlns:wpg="http://schemas.microsoft.com/office/word/2010/wordprocessingGroup" xmlns:wpi="http://schemas.microsoft.com/office/word/2010/wordprocessingInk" xmlns:wne="http://schemas.microsoft.com/office/word/2006/wordml" xmlns:wps="http://schemas.microsoft.com/office/word/2010/wordprocessingShape" mc:Ignorable="w14 w15 w16se w16cid w16 w16cex w16sdtdh w16du wp14">
   <w:p>
     <w:pPr>
       <w:pStyle w:val="Horizon2020"/>
@@ -15382,7 +15480,7 @@
 </file>
 
 <file path=word/header2.xml><?xml version="1.0" encoding="utf-8"?>
-<w:hdr xmlns:wpc="http://schemas.microsoft.com/office/word/2010/wordprocessingCanvas" xmlns:cx="http://schemas.microsoft.com/office/drawing/2014/chartex" xmlns:cx1="http://schemas.microsoft.com/office/drawing/2015/9/8/chartex" xmlns:cx2="http://schemas.microsoft.com/office/drawing/2015/10/21/chartex" xmlns:cx3="http://schemas.microsoft.com/office/drawing/2016/5/9/chartex" xmlns:cx4="http://schemas.microsoft.com/office/drawing/2016/5/10/chartex" xmlns:cx5="http://schemas.microsoft.com/office/drawing/2016/5/11/chartex" xmlns:cx6="http://schemas.microsoft.com/office/drawing/2016/5/12/chartex" xmlns:cx7="http://schemas.microsoft.com/office/drawing/2016/5/13/chartex" xmlns:cx8="http://schemas.microsoft.com/office/drawing/2016/5/14/chartex" xmlns:mc="http://schemas.openxmlformats.org/markup-compatibility/2006" xmlns:aink="http://schemas.microsoft.com/office/drawing/2016/ink" xmlns:am3d="http://schemas.microsoft.com/office/drawing/2017/model3d" xmlns:o="urn:schemas-microsoft-com:office:office" xmlns:oel="http://schemas.microsoft.com/office/2019/extlst" xmlns:r="http://schemas.openxmlformats.org/officeDocument/2006/relationships" xmlns:m="http://schemas.openxmlformats.org/officeDocument/2006/math" xmlns:v="urn:schemas-microsoft-com:vml" xmlns:wp14="http://schemas.microsoft.com/office/word/2010/wordprocessingDrawing" xmlns:wp="http://schemas.openxmlformats.org/drawingml/2006/wordprocessingDrawing" xmlns:w10="urn:schemas-microsoft-com:office:word" xmlns:w="http://schemas.openxmlformats.org/wordprocessingml/2006/main" xmlns:w14="http://schemas.microsoft.com/office/word/2010/wordml" xmlns:w15="http://schemas.microsoft.com/office/word/2012/wordml" xmlns:w16cex="http://schemas.microsoft.com/office/word/2018/wordml/cex" xmlns:w16cid="http://schemas.microsoft.com/office/word/2016/wordml/cid" xmlns:w16="http://schemas.microsoft.com/office/word/2018/wordml" xmlns:w16sdtdh="http://schemas.microsoft.com/office/word/2020/wordml/sdtdatahash" xmlns:w16se="http://schemas.microsoft.com/office/word/2015/wordml/symex" xmlns:wpg="http://schemas.microsoft.com/office/word/2010/wordprocessingGroup" xmlns:wpi="http://schemas.microsoft.com/office/word/2010/wordprocessingInk" xmlns:wne="http://schemas.microsoft.com/office/word/2006/wordml" xmlns:wps="http://schemas.microsoft.com/office/word/2010/wordprocessingShape" mc:Ignorable="w14 w15 w16se w16cid w16 w16cex w16sdtdh wp14">
+<w:hdr xmlns:wpc="http://schemas.microsoft.com/office/word/2010/wordprocessingCanvas" xmlns:cx="http://schemas.microsoft.com/office/drawing/2014/chartex" xmlns:cx1="http://schemas.microsoft.com/office/drawing/2015/9/8/chartex" xmlns:cx2="http://schemas.microsoft.com/office/drawing/2015/10/21/chartex" xmlns:cx3="http://schemas.microsoft.com/office/drawing/2016/5/9/chartex" xmlns:cx4="http://schemas.microsoft.com/office/drawing/2016/5/10/chartex" xmlns:cx5="http://schemas.microsoft.com/office/drawing/2016/5/11/chartex" xmlns:cx6="http://schemas.microsoft.com/office/drawing/2016/5/12/chartex" xmlns:cx7="http://schemas.microsoft.com/office/drawing/2016/5/13/chartex" xmlns:cx8="http://schemas.microsoft.com/office/drawing/2016/5/14/chartex" xmlns:mc="http://schemas.openxmlformats.org/markup-compatibility/2006" xmlns:aink="http://schemas.microsoft.com/office/drawing/2016/ink" xmlns:am3d="http://schemas.microsoft.com/office/drawing/2017/model3d" xmlns:o="urn:schemas-microsoft-com:office:office" xmlns:oel="http://schemas.microsoft.com/office/2019/extlst" xmlns:r="http://schemas.openxmlformats.org/officeDocument/2006/relationships" xmlns:m="http://schemas.openxmlformats.org/officeDocument/2006/math" xmlns:v="urn:schemas-microsoft-com:vml" xmlns:wp14="http://schemas.microsoft.com/office/word/2010/wordprocessingDrawing" xmlns:wp="http://schemas.openxmlformats.org/drawingml/2006/wordprocessingDrawing" xmlns:w10="urn:schemas-microsoft-com:office:word" xmlns:w="http://schemas.openxmlformats.org/wordprocessingml/2006/main" xmlns:w14="http://schemas.microsoft.com/office/word/2010/wordml" xmlns:w15="http://schemas.microsoft.com/office/word/2012/wordml" xmlns:w16cex="http://schemas.microsoft.com/office/word/2018/wordml/cex" xmlns:w16cid="http://schemas.microsoft.com/office/word/2016/wordml/cid" xmlns:w16="http://schemas.microsoft.com/office/word/2018/wordml" xmlns:w16du="http://schemas.microsoft.com/office/word/2023/wordml/word16du" xmlns:w16sdtdh="http://schemas.microsoft.com/office/word/2020/wordml/sdtdatahash" xmlns:w16se="http://schemas.microsoft.com/office/word/2015/wordml/symex" xmlns:wpg="http://schemas.microsoft.com/office/word/2010/wordprocessingGroup" xmlns:wpi="http://schemas.microsoft.com/office/word/2010/wordprocessingInk" xmlns:wne="http://schemas.microsoft.com/office/word/2006/wordml" xmlns:wps="http://schemas.microsoft.com/office/word/2010/wordprocessingShape" mc:Ignorable="w14 w15 w16se w16cid w16 w16cex w16sdtdh w16du wp14">
   <w:p>
     <w:pPr>
       <w:pStyle w:val="En-tte"/>
@@ -15392,7 +15490,7 @@
 </file>
 
 <file path=word/numbering.xml><?xml version="1.0" encoding="utf-8"?>
-<w:numbering xmlns:wpc="http://schemas.microsoft.com/office/word/2010/wordprocessingCanvas" xmlns:cx="http://schemas.microsoft.com/office/drawing/2014/chartex" xmlns:cx1="http://schemas.microsoft.com/office/drawing/2015/9/8/chartex" xmlns:cx2="http://schemas.microsoft.com/office/drawing/2015/10/21/chartex" xmlns:cx3="http://schemas.microsoft.com/office/drawing/2016/5/9/chartex" xmlns:cx4="http://schemas.microsoft.com/office/drawing/2016/5/10/chartex" xmlns:cx5="http://schemas.microsoft.com/office/drawing/2016/5/11/chartex" xmlns:cx6="http://schemas.microsoft.com/office/drawing/2016/5/12/chartex" xmlns:cx7="http://schemas.microsoft.com/office/drawing/2016/5/13/chartex" xmlns:cx8="http://schemas.microsoft.com/office/drawing/2016/5/14/chartex" xmlns:mc="http://schemas.openxmlformats.org/markup-compatibility/2006" xmlns:aink="http://schemas.microsoft.com/office/drawing/2016/ink" xmlns:am3d="http://schemas.microsoft.com/office/drawing/2017/model3d" xmlns:o="urn:schemas-microsoft-com:office:office" xmlns:oel="http://schemas.microsoft.com/office/2019/extlst" xmlns:r="http://schemas.openxmlformats.org/officeDocument/2006/relationships" xmlns:m="http://schemas.openxmlformats.org/officeDocument/2006/math" xmlns:v="urn:schemas-microsoft-com:vml" xmlns:wp14="http://schemas.microsoft.com/office/word/2010/wordprocessingDrawing" xmlns:wp="http://schemas.openxmlformats.org/drawingml/2006/wordprocessingDrawing" xmlns:w10="urn:schemas-microsoft-com:office:word" xmlns:w="http://schemas.openxmlformats.org/wordprocessingml/2006/main" xmlns:w14="http://schemas.microsoft.com/office/word/2010/wordml" xmlns:w15="http://schemas.microsoft.com/office/word/2012/wordml" xmlns:w16cex="http://schemas.microsoft.com/office/word/2018/wordml/cex" xmlns:w16cid="http://schemas.microsoft.com/office/word/2016/wordml/cid" xmlns:w16="http://schemas.microsoft.com/office/word/2018/wordml" xmlns:w16sdtdh="http://schemas.microsoft.com/office/word/2020/wordml/sdtdatahash" xmlns:w16se="http://schemas.microsoft.com/office/word/2015/wordml/symex" xmlns:wpg="http://schemas.microsoft.com/office/word/2010/wordprocessingGroup" xmlns:wpi="http://schemas.microsoft.com/office/word/2010/wordprocessingInk" xmlns:wne="http://schemas.microsoft.com/office/word/2006/wordml" xmlns:wps="http://schemas.microsoft.com/office/word/2010/wordprocessingShape" mc:Ignorable="w14 w15 w16se w16cid w16 w16cex w16sdtdh wp14">
+<w:numbering xmlns:wpc="http://schemas.microsoft.com/office/word/2010/wordprocessingCanvas" xmlns:cx="http://schemas.microsoft.com/office/drawing/2014/chartex" xmlns:cx1="http://schemas.microsoft.com/office/drawing/2015/9/8/chartex" xmlns:cx2="http://schemas.microsoft.com/office/drawing/2015/10/21/chartex" xmlns:cx3="http://schemas.microsoft.com/office/drawing/2016/5/9/chartex" xmlns:cx4="http://schemas.microsoft.com/office/drawing/2016/5/10/chartex" xmlns:cx5="http://schemas.microsoft.com/office/drawing/2016/5/11/chartex" xmlns:cx6="http://schemas.microsoft.com/office/drawing/2016/5/12/chartex" xmlns:cx7="http://schemas.microsoft.com/office/drawing/2016/5/13/chartex" xmlns:cx8="http://schemas.microsoft.com/office/drawing/2016/5/14/chartex" xmlns:mc="http://schemas.openxmlformats.org/markup-compatibility/2006" xmlns:aink="http://schemas.microsoft.com/office/drawing/2016/ink" xmlns:am3d="http://schemas.microsoft.com/office/drawing/2017/model3d" xmlns:o="urn:schemas-microsoft-com:office:office" xmlns:oel="http://schemas.microsoft.com/office/2019/extlst" xmlns:r="http://schemas.openxmlformats.org/officeDocument/2006/relationships" xmlns:m="http://schemas.openxmlformats.org/officeDocument/2006/math" xmlns:v="urn:schemas-microsoft-com:vml" xmlns:wp14="http://schemas.microsoft.com/office/word/2010/wordprocessingDrawing" xmlns:wp="http://schemas.openxmlformats.org/drawingml/2006/wordprocessingDrawing" xmlns:w10="urn:schemas-microsoft-com:office:word" xmlns:w="http://schemas.openxmlformats.org/wordprocessingml/2006/main" xmlns:w14="http://schemas.microsoft.com/office/word/2010/wordml" xmlns:w15="http://schemas.microsoft.com/office/word/2012/wordml" xmlns:w16cex="http://schemas.microsoft.com/office/word/2018/wordml/cex" xmlns:w16cid="http://schemas.microsoft.com/office/word/2016/wordml/cid" xmlns:w16="http://schemas.microsoft.com/office/word/2018/wordml" xmlns:w16du="http://schemas.microsoft.com/office/word/2023/wordml/word16du" xmlns:w16sdtdh="http://schemas.microsoft.com/office/word/2020/wordml/sdtdatahash" xmlns:w16se="http://schemas.microsoft.com/office/word/2015/wordml/symex" xmlns:wpg="http://schemas.microsoft.com/office/word/2010/wordprocessingGroup" xmlns:wpi="http://schemas.microsoft.com/office/word/2010/wordprocessingInk" xmlns:wne="http://schemas.microsoft.com/office/word/2006/wordml" xmlns:wps="http://schemas.microsoft.com/office/word/2010/wordprocessingShape" mc:Ignorable="w14 w15 w16se w16cid w16 w16cex w16sdtdh w16du wp14">
   <w:abstractNum w:abstractNumId="0" w15:restartNumberingAfterBreak="0">
     <w:nsid w:val="FFFFFF7C"/>
     <w:multiLevelType w:val="singleLevel"/>
@@ -19548,7 +19646,7 @@
 </file>
 
 <file path=word/styles.xml><?xml version="1.0" encoding="utf-8"?>
-<w:styles xmlns:mc="http://schemas.openxmlformats.org/markup-compatibility/2006" xmlns:r="http://schemas.openxmlformats.org/officeDocument/2006/relationships" xmlns:w="http://schemas.openxmlformats.org/wordprocessingml/2006/main" xmlns:w14="http://schemas.microsoft.com/office/word/2010/wordml" xmlns:w15="http://schemas.microsoft.com/office/word/2012/wordml" xmlns:w16cex="http://schemas.microsoft.com/office/word/2018/wordml/cex" xmlns:w16cid="http://schemas.microsoft.com/office/word/2016/wordml/cid" xmlns:w16="http://schemas.microsoft.com/office/word/2018/wordml" xmlns:w16sdtdh="http://schemas.microsoft.com/office/word/2020/wordml/sdtdatahash" xmlns:w16se="http://schemas.microsoft.com/office/word/2015/wordml/symex" mc:Ignorable="w14 w15 w16se w16cid w16 w16cex w16sdtdh">
+<w:styles xmlns:mc="http://schemas.openxmlformats.org/markup-compatibility/2006" xmlns:r="http://schemas.openxmlformats.org/officeDocument/2006/relationships" xmlns:w="http://schemas.openxmlformats.org/wordprocessingml/2006/main" xmlns:w14="http://schemas.microsoft.com/office/word/2010/wordml" xmlns:w15="http://schemas.microsoft.com/office/word/2012/wordml" xmlns:w16cex="http://schemas.microsoft.com/office/word/2018/wordml/cex" xmlns:w16cid="http://schemas.microsoft.com/office/word/2016/wordml/cid" xmlns:w16="http://schemas.microsoft.com/office/word/2018/wordml" xmlns:w16du="http://schemas.microsoft.com/office/word/2023/wordml/word16du" xmlns:w16sdtdh="http://schemas.microsoft.com/office/word/2020/wordml/sdtdatahash" xmlns:w16se="http://schemas.microsoft.com/office/word/2015/wordml/symex" mc:Ignorable="w14 w15 w16se w16cid w16 w16cex w16sdtdh w16du">
   <w:docDefaults>
     <w:rPrDefault>
       <w:rPr>

</xml_diff>